<commit_message>
run until module 5 and optimized module 4c
</commit_message>
<xml_diff>
--- a/2_Funds_parser/README texts/2_Module_4c.docx
+++ b/2_Funds_parser/README texts/2_Module_4c.docx
@@ -14,50 +14,38 @@
           <w:b/>
           <w:bCs/>
         </w:rPr>
-        <w:t>What Module 4c does</w:t>
+        <w:t>Module 4c — what it does</w:t>
       </w:r>
     </w:p>
     <w:p>
-      <w:r>
-        <w:t xml:space="preserve">Module 4c sits between </w:t>
-      </w:r>
-      <w:r>
-        <w:rPr>
-          <w:b/>
-          <w:bCs/>
-        </w:rPr>
-        <w:t>M4b (rank)</w:t>
-      </w:r>
-      <w:r>
-        <w:t xml:space="preserve"> and </w:t>
-      </w:r>
-      <w:r>
-        <w:rPr>
-          <w:b/>
-          <w:bCs/>
-        </w:rPr>
-        <w:t>M5 (packs)</w:t>
-      </w:r>
-      <w:r>
-        <w:t xml:space="preserve">. It pre-fetches free </w:t>
-      </w:r>
-      <w:r>
-        <w:rPr>
-          <w:b/>
-          <w:bCs/>
-        </w:rPr>
-        <w:t>financial</w:t>
-      </w:r>
-      <w:r>
-        <w:t xml:space="preserve"> data from SEC EDGAR for biotech tickers and stores it in data/</w:t>
+      <w:pPr>
+        <w:rPr>
+          <w:b/>
+          <w:bCs/>
+        </w:rPr>
+      </w:pPr>
+      <w:r>
+        <w:rPr>
+          <w:b/>
+          <w:bCs/>
+        </w:rPr>
+        <w:t>One-line: A free SEC EDGAR scraper that pre-fetches deterministic financial data for every biotech ticker in the M4b ranked feed, into data/</w:t>
       </w:r>
       <w:proofErr w:type="spellStart"/>
       <w:r>
+        <w:rPr>
+          <w:b/>
+          <w:bCs/>
+        </w:rPr>
         <w:t>fundamentals.db</w:t>
       </w:r>
       <w:proofErr w:type="spellEnd"/>
       <w:r>
-        <w:t>, so M5's context packs carry the data for M6's LLM prompt.</w:t>
+        <w:rPr>
+          <w:b/>
+          <w:bCs/>
+        </w:rPr>
+        <w:t>, so M5 can inject it into the LLM context pack and M6 doesn't have to web-search for it.</w:t>
       </w:r>
     </w:p>
     <w:p>
@@ -72,54 +60,130 @@
           <w:b/>
           <w:bCs/>
         </w:rPr>
-        <w:t>Pipeline position</w:t>
+        <w:t>Where it sits</w:t>
       </w:r>
     </w:p>
     <w:p>
-      <w:r>
-        <w:t>M4b (rank) → M4c (fundamentals) → M5 (packs) → M6 (LLM)</w:t>
+      <w:pPr>
+        <w:rPr>
+          <w:b/>
+          <w:bCs/>
+        </w:rPr>
+      </w:pPr>
+      <w:r>
+        <w:rPr>
+          <w:b/>
+          <w:bCs/>
+        </w:rPr>
+        <w:t>M4b (rank 972 candidates)</w:t>
       </w:r>
     </w:p>
     <w:p>
-      <w:r>
-        <w:t xml:space="preserve">                  │                   │</w:t>
+      <w:pPr>
+        <w:rPr>
+          <w:b/>
+          <w:bCs/>
+        </w:rPr>
+      </w:pPr>
+      <w:r>
+        <w:rPr>
+          <w:b/>
+          <w:bCs/>
+        </w:rPr>
+        <w:t xml:space="preserve">        │</w:t>
       </w:r>
     </w:p>
     <w:p>
-      <w:r>
-        <w:t xml:space="preserve">                  </w:t>
+      <w:pPr>
+        <w:rPr>
+          <w:b/>
+          <w:bCs/>
+        </w:rPr>
+      </w:pPr>
+      <w:r>
+        <w:rPr>
+          <w:b/>
+          <w:bCs/>
+        </w:rPr>
+        <w:t xml:space="preserve">        </w:t>
       </w:r>
       <w:r>
         <w:rPr>
           <w:rFonts w:ascii="Arial" w:hAnsi="Arial" w:cs="Arial"/>
-        </w:rPr>
-        <w:t>▼</w:t>
-      </w:r>
-      <w:r>
-        <w:t xml:space="preserve">                   </w:t>
-      </w:r>
-      <w:r>
-        <w:rPr>
-          <w:rFonts w:ascii="Arial" w:hAnsi="Arial" w:cs="Arial"/>
+          <w:b/>
+          <w:bCs/>
         </w:rPr>
         <w:t>▼</w:t>
       </w:r>
     </w:p>
     <w:p>
-      <w:r>
-        <w:t xml:space="preserve">         data/</w:t>
+      <w:pPr>
+        <w:rPr>
+          <w:b/>
+          <w:bCs/>
+        </w:rPr>
+      </w:pPr>
+      <w:r>
+        <w:rPr>
+          <w:b/>
+          <w:bCs/>
+        </w:rPr>
+        <w:t xml:space="preserve">  M4c (this) ───── reads industry from data/</w:t>
       </w:r>
       <w:proofErr w:type="spellStart"/>
       <w:r>
-        <w:t>fundamentals.db</w:t>
+        <w:rPr>
+          <w:b/>
+          <w:bCs/>
+        </w:rPr>
+        <w:t>prices.db</w:t>
       </w:r>
       <w:proofErr w:type="spellEnd"/>
       <w:r>
-        <w:t xml:space="preserve">   </w:t>
+        <w:rPr>
+          <w:b/>
+          <w:bCs/>
+        </w:rPr>
+        <w:t xml:space="preserve"> (biotech-only gate)</w:t>
+      </w:r>
+    </w:p>
+    <w:p>
+      <w:pPr>
+        <w:rPr>
+          <w:b/>
+          <w:bCs/>
+        </w:rPr>
+      </w:pPr>
+      <w:r>
+        <w:rPr>
+          <w:b/>
+          <w:bCs/>
+        </w:rPr>
+        <w:t xml:space="preserve">        │           reads </w:t>
       </w:r>
       <w:proofErr w:type="spellStart"/>
       <w:r>
-        <w:t>pack.fundamentals</w:t>
+        <w:rPr>
+          <w:b/>
+          <w:bCs/>
+        </w:rPr>
+        <w:t>ticker→CIK</w:t>
+      </w:r>
+      <w:proofErr w:type="spellEnd"/>
+      <w:r>
+        <w:rPr>
+          <w:b/>
+          <w:bCs/>
+        </w:rPr>
+        <w:t xml:space="preserve"> from Outputs/</w:t>
+      </w:r>
+      <w:proofErr w:type="spellStart"/>
+      <w:r>
+        <w:rPr>
+          <w:b/>
+          <w:bCs/>
+        </w:rPr>
+        <w:t>sec_company_tickers.json</w:t>
       </w:r>
       <w:proofErr w:type="spellEnd"/>
     </w:p>
@@ -135,101 +199,185 @@
           <w:b/>
           <w:bCs/>
         </w:rPr>
-        <w:t>Two-step flow</w:t>
-      </w:r>
+        <w:t xml:space="preserve">        │           writes to data/</w:t>
+      </w:r>
+      <w:proofErr w:type="spellStart"/>
+      <w:r>
+        <w:rPr>
+          <w:b/>
+          <w:bCs/>
+        </w:rPr>
+        <w:t>fundamentals.db</w:t>
+      </w:r>
+      <w:proofErr w:type="spellEnd"/>
     </w:p>
     <w:p>
-      <w:r>
-        <w:rPr>
-          <w:b/>
-          <w:bCs/>
-        </w:rPr>
-        <w:t>1. Industry gate.</w:t>
-      </w:r>
-      <w:r>
-        <w:t xml:space="preserve"> M4c reads each ticker's industry from data/</w:t>
-      </w:r>
-      <w:proofErr w:type="spellStart"/>
-      <w:r>
-        <w:t>prices.db.ticker_snapshot</w:t>
-      </w:r>
-      <w:proofErr w:type="spellEnd"/>
-      <w:r>
-        <w:t>. Only three industries pass:</w:t>
+      <w:pPr>
+        <w:rPr>
+          <w:b/>
+          <w:bCs/>
+        </w:rPr>
+      </w:pPr>
+      <w:r>
+        <w:rPr>
+          <w:b/>
+          <w:bCs/>
+        </w:rPr>
+        <w:t xml:space="preserve">        </w:t>
+      </w:r>
+      <w:r>
+        <w:rPr>
+          <w:rFonts w:ascii="Arial" w:hAnsi="Arial" w:cs="Arial"/>
+          <w:b/>
+          <w:bCs/>
+        </w:rPr>
+        <w:t>▼</w:t>
       </w:r>
     </w:p>
     <w:p>
       <w:pPr>
-        <w:numPr>
-          <w:ilvl w:val="0"/>
-          <w:numId w:val="15"/>
-        </w:numPr>
-      </w:pPr>
-      <w:r>
-        <w:t>Biotechnology</w:t>
+        <w:rPr>
+          <w:b/>
+          <w:bCs/>
+        </w:rPr>
+      </w:pPr>
+      <w:r>
+        <w:rPr>
+          <w:b/>
+          <w:bCs/>
+        </w:rPr>
+        <w:t xml:space="preserve">  M5 (build packs) ── reads data/</w:t>
+      </w:r>
+      <w:proofErr w:type="spellStart"/>
+      <w:r>
+        <w:rPr>
+          <w:b/>
+          <w:bCs/>
+        </w:rPr>
+        <w:t>fundamentals.db</w:t>
+      </w:r>
+      <w:proofErr w:type="spellEnd"/>
+      <w:r>
+        <w:rPr>
+          <w:b/>
+          <w:bCs/>
+        </w:rPr>
+        <w:t>, adds `</w:t>
+      </w:r>
+      <w:proofErr w:type="spellStart"/>
+      <w:r>
+        <w:rPr>
+          <w:b/>
+          <w:bCs/>
+        </w:rPr>
+        <w:t>pack.fundamentals</w:t>
+      </w:r>
+      <w:proofErr w:type="spellEnd"/>
+      <w:r>
+        <w:rPr>
+          <w:b/>
+          <w:bCs/>
+        </w:rPr>
+        <w:t>` block</w:t>
       </w:r>
     </w:p>
     <w:p>
       <w:pPr>
-        <w:numPr>
-          <w:ilvl w:val="0"/>
-          <w:numId w:val="15"/>
-        </w:numPr>
-      </w:pPr>
-      <w:r>
-        <w:t>Drug Manufacturers - Specialty &amp; Generic</w:t>
+        <w:rPr>
+          <w:b/>
+          <w:bCs/>
+        </w:rPr>
+      </w:pPr>
+      <w:r>
+        <w:rPr>
+          <w:b/>
+          <w:bCs/>
+        </w:rPr>
+        <w:t xml:space="preserve">        │</w:t>
       </w:r>
     </w:p>
     <w:p>
       <w:pPr>
-        <w:numPr>
-          <w:ilvl w:val="0"/>
-          <w:numId w:val="15"/>
-        </w:numPr>
-      </w:pPr>
-      <w:r>
-        <w:t>Drug Manufacturers - General</w:t>
+        <w:rPr>
+          <w:b/>
+          <w:bCs/>
+        </w:rPr>
+      </w:pPr>
+      <w:r>
+        <w:rPr>
+          <w:b/>
+          <w:bCs/>
+        </w:rPr>
+        <w:t xml:space="preserve">        </w:t>
+      </w:r>
+      <w:r>
+        <w:rPr>
+          <w:rFonts w:ascii="Arial" w:hAnsi="Arial" w:cs="Arial"/>
+          <w:b/>
+          <w:bCs/>
+        </w:rPr>
+        <w:t>▼</w:t>
       </w:r>
     </w:p>
     <w:p>
-      <w:r>
-        <w:t xml:space="preserve">Anything else (e.g. GRAL = Diagnostics &amp; Research) gets </w:t>
-      </w:r>
-      <w:proofErr w:type="spellStart"/>
-      <w:r>
-        <w:t>fetch_log.last_status</w:t>
-      </w:r>
-      <w:proofErr w:type="spellEnd"/>
-      <w:r>
-        <w:t>='</w:t>
-      </w:r>
-      <w:proofErr w:type="spellStart"/>
-      <w:r>
-        <w:t>skipped_non_biotech</w:t>
-      </w:r>
-      <w:proofErr w:type="spellEnd"/>
-      <w:r>
-        <w:t>'. M5 then emits packs without a fundamentals block, and M6 web-searches for those fields like before.</w:t>
+      <w:pPr>
+        <w:rPr>
+          <w:b/>
+          <w:bCs/>
+        </w:rPr>
+      </w:pPr>
+      <w:r>
+        <w:rPr>
+          <w:b/>
+          <w:bCs/>
+        </w:rPr>
+        <w:t xml:space="preserve">  M6 (LLM scoring) ── HARD RULES #20-22 say: use pack.fundamentals.* verbatim;</w:t>
       </w:r>
     </w:p>
     <w:p>
-      <w:r>
-        <w:rPr>
-          <w:b/>
-          <w:bCs/>
-        </w:rPr>
-        <w:t>2. Per-source fetch (4 sources).</w:t>
-      </w:r>
-      <w:r>
-        <w:t xml:space="preserve"> For each biotech ticker, M4c hits SEC EDGAR via the existing _EDGAR_LIMITER (9 </w:t>
+      <w:pPr>
+        <w:rPr>
+          <w:b/>
+          <w:bCs/>
+        </w:rPr>
+      </w:pPr>
+      <w:r>
+        <w:rPr>
+          <w:b/>
+          <w:bCs/>
+        </w:rPr>
+        <w:t xml:space="preserve">                      </w:t>
       </w:r>
       <w:proofErr w:type="spellStart"/>
       <w:r>
-        <w:t>req</w:t>
+        <w:rPr>
+          <w:b/>
+          <w:bCs/>
+        </w:rPr>
+        <w:t>web_search</w:t>
       </w:r>
       <w:proofErr w:type="spellEnd"/>
       <w:r>
-        <w:t>/s, shared with M2):</w:t>
+        <w:rPr>
+          <w:b/>
+          <w:bCs/>
+        </w:rPr>
+        <w:t xml:space="preserve"> only when fields are null</w:t>
+      </w:r>
+    </w:p>
+    <w:p>
+      <w:pPr>
+        <w:rPr>
+          <w:b/>
+          <w:bCs/>
+        </w:rPr>
+      </w:pPr>
+      <w:r>
+        <w:rPr>
+          <w:b/>
+          <w:bCs/>
+        </w:rPr>
+        <w:t>What it fetches (4 SEC sources, biotech tickers only)</w:t>
       </w:r>
     </w:p>
     <w:tbl>
@@ -251,10 +399,9 @@
         <w:tblLook w:val="04A0" w:firstRow="1" w:lastRow="0" w:firstColumn="1" w:lastColumn="0" w:noHBand="0" w:noVBand="1"/>
       </w:tblPr>
       <w:tblGrid>
-        <w:gridCol w:w="1142"/>
-        <w:gridCol w:w="5087"/>
-        <w:gridCol w:w="712"/>
-        <w:gridCol w:w="2079"/>
+        <w:gridCol w:w="1922"/>
+        <w:gridCol w:w="5119"/>
+        <w:gridCol w:w="1979"/>
       </w:tblGrid>
       <w:tr>
         <w:trPr>
@@ -326,7 +473,898 @@
                 <w:b/>
                 <w:bCs/>
               </w:rPr>
-              <w:t>What it fetches</w:t>
+              <w:t>What it pulls</w:t>
+            </w:r>
+          </w:p>
+        </w:tc>
+        <w:tc>
+          <w:tcPr>
+            <w:tcW w:w="0" w:type="auto"/>
+            <w:tcBorders>
+              <w:top w:val="single" w:sz="2" w:space="0" w:color="2A2B2C"/>
+              <w:left w:val="single" w:sz="2" w:space="0" w:color="2A2B2C"/>
+              <w:bottom w:val="single" w:sz="2" w:space="0" w:color="2A2B2C"/>
+              <w:right w:val="single" w:sz="2" w:space="0" w:color="2A2B2C"/>
+            </w:tcBorders>
+            <w:shd w:val="clear" w:color="auto" w:fill="191A1B"/>
+            <w:tcMar>
+              <w:top w:w="30" w:type="dxa"/>
+              <w:left w:w="30" w:type="dxa"/>
+              <w:bottom w:w="30" w:type="dxa"/>
+              <w:right w:w="30" w:type="dxa"/>
+            </w:tcMar>
+            <w:vAlign w:val="center"/>
+            <w:hideMark/>
+          </w:tcPr>
+          <w:p>
+            <w:pPr>
+              <w:rPr>
+                <w:b/>
+                <w:bCs/>
+              </w:rPr>
+            </w:pPr>
+            <w:r>
+              <w:rPr>
+                <w:b/>
+                <w:bCs/>
+              </w:rPr>
+              <w:t>Result table</w:t>
+            </w:r>
+          </w:p>
+        </w:tc>
+      </w:tr>
+      <w:tr>
+        <w:tc>
+          <w:tcPr>
+            <w:tcW w:w="0" w:type="auto"/>
+            <w:tcBorders>
+              <w:top w:val="single" w:sz="2" w:space="0" w:color="2A2B2C"/>
+              <w:left w:val="single" w:sz="2" w:space="0" w:color="2A2B2C"/>
+              <w:bottom w:val="single" w:sz="2" w:space="0" w:color="2A2B2C"/>
+              <w:right w:val="single" w:sz="2" w:space="0" w:color="2A2B2C"/>
+            </w:tcBorders>
+            <w:shd w:val="clear" w:color="auto" w:fill="191A1B"/>
+            <w:tcMar>
+              <w:top w:w="30" w:type="dxa"/>
+              <w:left w:w="30" w:type="dxa"/>
+              <w:bottom w:w="30" w:type="dxa"/>
+              <w:right w:w="30" w:type="dxa"/>
+            </w:tcMar>
+            <w:vAlign w:val="center"/>
+            <w:hideMark/>
+          </w:tcPr>
+          <w:p>
+            <w:pPr>
+              <w:rPr>
+                <w:b/>
+                <w:bCs/>
+              </w:rPr>
+            </w:pPr>
+            <w:proofErr w:type="spellStart"/>
+            <w:r>
+              <w:rPr>
+                <w:b/>
+                <w:bCs/>
+              </w:rPr>
+              <w:t>companyfacts</w:t>
+            </w:r>
+            <w:proofErr w:type="spellEnd"/>
+            <w:r>
+              <w:rPr>
+                <w:b/>
+                <w:bCs/>
+              </w:rPr>
+              <w:t> XBRL</w:t>
+            </w:r>
+          </w:p>
+        </w:tc>
+        <w:tc>
+          <w:tcPr>
+            <w:tcW w:w="0" w:type="auto"/>
+            <w:tcBorders>
+              <w:top w:val="single" w:sz="2" w:space="0" w:color="2A2B2C"/>
+              <w:left w:val="single" w:sz="2" w:space="0" w:color="2A2B2C"/>
+              <w:bottom w:val="single" w:sz="2" w:space="0" w:color="2A2B2C"/>
+              <w:right w:val="single" w:sz="2" w:space="0" w:color="2A2B2C"/>
+            </w:tcBorders>
+            <w:shd w:val="clear" w:color="auto" w:fill="191A1B"/>
+            <w:tcMar>
+              <w:top w:w="30" w:type="dxa"/>
+              <w:left w:w="30" w:type="dxa"/>
+              <w:bottom w:w="30" w:type="dxa"/>
+              <w:right w:w="30" w:type="dxa"/>
+            </w:tcMar>
+            <w:vAlign w:val="center"/>
+            <w:hideMark/>
+          </w:tcPr>
+          <w:p>
+            <w:pPr>
+              <w:rPr>
+                <w:b/>
+                <w:bCs/>
+              </w:rPr>
+            </w:pPr>
+            <w:r>
+              <w:rPr>
+                <w:b/>
+                <w:bCs/>
+              </w:rPr>
+              <w:t>Cash, short-term investments, total assets/</w:t>
+            </w:r>
+            <w:proofErr w:type="spellStart"/>
+            <w:r>
+              <w:rPr>
+                <w:b/>
+                <w:bCs/>
+              </w:rPr>
+              <w:t>liabs</w:t>
+            </w:r>
+            <w:proofErr w:type="spellEnd"/>
+            <w:r>
+              <w:rPr>
+                <w:b/>
+                <w:bCs/>
+              </w:rPr>
+              <w:t>, AR, PP&amp;E, R&amp;D and G&amp;A expense (TTM), operating cash flow (TTM), shares outstanding — most recent 8 periods. From this M4c computes </w:t>
+            </w:r>
+            <w:proofErr w:type="spellStart"/>
+            <w:r>
+              <w:rPr>
+                <w:b/>
+                <w:bCs/>
+              </w:rPr>
+              <w:t>quarterly_burn</w:t>
+            </w:r>
+            <w:proofErr w:type="spellEnd"/>
+            <w:r>
+              <w:rPr>
+                <w:b/>
+                <w:bCs/>
+              </w:rPr>
+              <w:t> and </w:t>
+            </w:r>
+            <w:proofErr w:type="spellStart"/>
+            <w:r>
+              <w:rPr>
+                <w:b/>
+                <w:bCs/>
+              </w:rPr>
+              <w:t>runway_months</w:t>
+            </w:r>
+            <w:proofErr w:type="spellEnd"/>
+            <w:r>
+              <w:rPr>
+                <w:b/>
+                <w:bCs/>
+              </w:rPr>
+              <w:t>.</w:t>
+            </w:r>
+          </w:p>
+        </w:tc>
+        <w:tc>
+          <w:tcPr>
+            <w:tcW w:w="0" w:type="auto"/>
+            <w:tcBorders>
+              <w:top w:val="single" w:sz="2" w:space="0" w:color="2A2B2C"/>
+              <w:left w:val="single" w:sz="2" w:space="0" w:color="2A2B2C"/>
+              <w:bottom w:val="single" w:sz="2" w:space="0" w:color="2A2B2C"/>
+              <w:right w:val="single" w:sz="2" w:space="0" w:color="2A2B2C"/>
+            </w:tcBorders>
+            <w:shd w:val="clear" w:color="auto" w:fill="191A1B"/>
+            <w:tcMar>
+              <w:top w:w="30" w:type="dxa"/>
+              <w:left w:w="30" w:type="dxa"/>
+              <w:bottom w:w="30" w:type="dxa"/>
+              <w:right w:w="30" w:type="dxa"/>
+            </w:tcMar>
+            <w:vAlign w:val="center"/>
+            <w:hideMark/>
+          </w:tcPr>
+          <w:p>
+            <w:pPr>
+              <w:rPr>
+                <w:b/>
+                <w:bCs/>
+              </w:rPr>
+            </w:pPr>
+            <w:r>
+              <w:rPr>
+                <w:b/>
+                <w:bCs/>
+              </w:rPr>
+              <w:t>financials (one row per period)</w:t>
+            </w:r>
+          </w:p>
+        </w:tc>
+      </w:tr>
+      <w:tr>
+        <w:tc>
+          <w:tcPr>
+            <w:tcW w:w="0" w:type="auto"/>
+            <w:tcBorders>
+              <w:top w:val="single" w:sz="2" w:space="0" w:color="2A2B2C"/>
+              <w:left w:val="single" w:sz="2" w:space="0" w:color="2A2B2C"/>
+              <w:bottom w:val="single" w:sz="2" w:space="0" w:color="2A2B2C"/>
+              <w:right w:val="single" w:sz="2" w:space="0" w:color="2A2B2C"/>
+            </w:tcBorders>
+            <w:shd w:val="clear" w:color="auto" w:fill="191A1B"/>
+            <w:tcMar>
+              <w:top w:w="30" w:type="dxa"/>
+              <w:left w:w="30" w:type="dxa"/>
+              <w:bottom w:w="30" w:type="dxa"/>
+              <w:right w:w="30" w:type="dxa"/>
+            </w:tcMar>
+            <w:vAlign w:val="center"/>
+            <w:hideMark/>
+          </w:tcPr>
+          <w:p>
+            <w:pPr>
+              <w:rPr>
+                <w:b/>
+                <w:bCs/>
+              </w:rPr>
+            </w:pPr>
+            <w:r>
+              <w:rPr>
+                <w:b/>
+                <w:bCs/>
+              </w:rPr>
+              <w:t>submissions</w:t>
+            </w:r>
+          </w:p>
+        </w:tc>
+        <w:tc>
+          <w:tcPr>
+            <w:tcW w:w="0" w:type="auto"/>
+            <w:tcBorders>
+              <w:top w:val="single" w:sz="2" w:space="0" w:color="2A2B2C"/>
+              <w:left w:val="single" w:sz="2" w:space="0" w:color="2A2B2C"/>
+              <w:bottom w:val="single" w:sz="2" w:space="0" w:color="2A2B2C"/>
+              <w:right w:val="single" w:sz="2" w:space="0" w:color="2A2B2C"/>
+            </w:tcBorders>
+            <w:shd w:val="clear" w:color="auto" w:fill="191A1B"/>
+            <w:tcMar>
+              <w:top w:w="30" w:type="dxa"/>
+              <w:left w:w="30" w:type="dxa"/>
+              <w:bottom w:w="30" w:type="dxa"/>
+              <w:right w:w="30" w:type="dxa"/>
+            </w:tcMar>
+            <w:vAlign w:val="center"/>
+            <w:hideMark/>
+          </w:tcPr>
+          <w:p>
+            <w:pPr>
+              <w:rPr>
+                <w:b/>
+                <w:bCs/>
+              </w:rPr>
+            </w:pPr>
+            <w:r>
+              <w:rPr>
+                <w:b/>
+                <w:bCs/>
+              </w:rPr>
+              <w:t>Recent filings list, filtered to forms 4, 8-K, S-3, S-3/A, 424B5</w:t>
+            </w:r>
+          </w:p>
+        </w:tc>
+        <w:tc>
+          <w:tcPr>
+            <w:tcW w:w="0" w:type="auto"/>
+            <w:tcBorders>
+              <w:top w:val="single" w:sz="2" w:space="0" w:color="2A2B2C"/>
+              <w:left w:val="single" w:sz="2" w:space="0" w:color="2A2B2C"/>
+              <w:bottom w:val="single" w:sz="2" w:space="0" w:color="2A2B2C"/>
+              <w:right w:val="single" w:sz="2" w:space="0" w:color="2A2B2C"/>
+            </w:tcBorders>
+            <w:shd w:val="clear" w:color="auto" w:fill="191A1B"/>
+            <w:tcMar>
+              <w:top w:w="30" w:type="dxa"/>
+              <w:left w:w="30" w:type="dxa"/>
+              <w:bottom w:w="30" w:type="dxa"/>
+              <w:right w:w="30" w:type="dxa"/>
+            </w:tcMar>
+            <w:vAlign w:val="center"/>
+            <w:hideMark/>
+          </w:tcPr>
+          <w:p>
+            <w:pPr>
+              <w:rPr>
+                <w:b/>
+                <w:bCs/>
+              </w:rPr>
+            </w:pPr>
+            <w:r>
+              <w:rPr>
+                <w:b/>
+                <w:bCs/>
+              </w:rPr>
+              <w:t>(intermediate — drives the next two)</w:t>
+            </w:r>
+          </w:p>
+        </w:tc>
+      </w:tr>
+      <w:tr>
+        <w:tc>
+          <w:tcPr>
+            <w:tcW w:w="0" w:type="auto"/>
+            <w:tcBorders>
+              <w:top w:val="single" w:sz="2" w:space="0" w:color="2A2B2C"/>
+              <w:left w:val="single" w:sz="2" w:space="0" w:color="2A2B2C"/>
+              <w:bottom w:val="single" w:sz="2" w:space="0" w:color="2A2B2C"/>
+              <w:right w:val="single" w:sz="2" w:space="0" w:color="2A2B2C"/>
+            </w:tcBorders>
+            <w:shd w:val="clear" w:color="auto" w:fill="191A1B"/>
+            <w:tcMar>
+              <w:top w:w="30" w:type="dxa"/>
+              <w:left w:w="30" w:type="dxa"/>
+              <w:bottom w:w="30" w:type="dxa"/>
+              <w:right w:w="30" w:type="dxa"/>
+            </w:tcMar>
+            <w:vAlign w:val="center"/>
+            <w:hideMark/>
+          </w:tcPr>
+          <w:p>
+            <w:pPr>
+              <w:rPr>
+                <w:b/>
+                <w:bCs/>
+              </w:rPr>
+            </w:pPr>
+            <w:r>
+              <w:rPr>
+                <w:b/>
+                <w:bCs/>
+              </w:rPr>
+              <w:t>Form 4 OWNERSHIP DOCUMENT XML</w:t>
+            </w:r>
+          </w:p>
+        </w:tc>
+        <w:tc>
+          <w:tcPr>
+            <w:tcW w:w="0" w:type="auto"/>
+            <w:tcBorders>
+              <w:top w:val="single" w:sz="2" w:space="0" w:color="2A2B2C"/>
+              <w:left w:val="single" w:sz="2" w:space="0" w:color="2A2B2C"/>
+              <w:bottom w:val="single" w:sz="2" w:space="0" w:color="2A2B2C"/>
+              <w:right w:val="single" w:sz="2" w:space="0" w:color="2A2B2C"/>
+            </w:tcBorders>
+            <w:shd w:val="clear" w:color="auto" w:fill="191A1B"/>
+            <w:tcMar>
+              <w:top w:w="30" w:type="dxa"/>
+              <w:left w:w="30" w:type="dxa"/>
+              <w:bottom w:w="30" w:type="dxa"/>
+              <w:right w:w="30" w:type="dxa"/>
+            </w:tcMar>
+            <w:vAlign w:val="center"/>
+            <w:hideMark/>
+          </w:tcPr>
+          <w:p>
+            <w:pPr>
+              <w:rPr>
+                <w:b/>
+                <w:bCs/>
+              </w:rPr>
+            </w:pPr>
+            <w:r>
+              <w:rPr>
+                <w:b/>
+                <w:bCs/>
+              </w:rPr>
+              <w:t>Every insider transaction in the last 3y on cold start (180d on subsequent runs): who bought/sold, role (CEO/CFO/Director/10% owner), shares, price, date</w:t>
+            </w:r>
+          </w:p>
+        </w:tc>
+        <w:tc>
+          <w:tcPr>
+            <w:tcW w:w="0" w:type="auto"/>
+            <w:tcBorders>
+              <w:top w:val="single" w:sz="2" w:space="0" w:color="2A2B2C"/>
+              <w:left w:val="single" w:sz="2" w:space="0" w:color="2A2B2C"/>
+              <w:bottom w:val="single" w:sz="2" w:space="0" w:color="2A2B2C"/>
+              <w:right w:val="single" w:sz="2" w:space="0" w:color="2A2B2C"/>
+            </w:tcBorders>
+            <w:shd w:val="clear" w:color="auto" w:fill="191A1B"/>
+            <w:tcMar>
+              <w:top w:w="30" w:type="dxa"/>
+              <w:left w:w="30" w:type="dxa"/>
+              <w:bottom w:w="30" w:type="dxa"/>
+              <w:right w:w="30" w:type="dxa"/>
+            </w:tcMar>
+            <w:vAlign w:val="center"/>
+            <w:hideMark/>
+          </w:tcPr>
+          <w:p>
+            <w:pPr>
+              <w:rPr>
+                <w:b/>
+                <w:bCs/>
+              </w:rPr>
+            </w:pPr>
+            <w:proofErr w:type="spellStart"/>
+            <w:r>
+              <w:rPr>
+                <w:b/>
+                <w:bCs/>
+              </w:rPr>
+              <w:t>insider_transactions</w:t>
+            </w:r>
+            <w:proofErr w:type="spellEnd"/>
+          </w:p>
+        </w:tc>
+      </w:tr>
+      <w:tr>
+        <w:tc>
+          <w:tcPr>
+            <w:tcW w:w="0" w:type="auto"/>
+            <w:tcBorders>
+              <w:top w:val="single" w:sz="2" w:space="0" w:color="2A2B2C"/>
+              <w:left w:val="single" w:sz="2" w:space="0" w:color="2A2B2C"/>
+              <w:bottom w:val="single" w:sz="2" w:space="0" w:color="2A2B2C"/>
+              <w:right w:val="single" w:sz="2" w:space="0" w:color="2A2B2C"/>
+            </w:tcBorders>
+            <w:shd w:val="clear" w:color="auto" w:fill="191A1B"/>
+            <w:tcMar>
+              <w:top w:w="30" w:type="dxa"/>
+              <w:left w:w="30" w:type="dxa"/>
+              <w:bottom w:w="30" w:type="dxa"/>
+              <w:right w:w="30" w:type="dxa"/>
+            </w:tcMar>
+            <w:vAlign w:val="center"/>
+            <w:hideMark/>
+          </w:tcPr>
+          <w:p>
+            <w:pPr>
+              <w:rPr>
+                <w:b/>
+                <w:bCs/>
+              </w:rPr>
+            </w:pPr>
+            <w:r>
+              <w:rPr>
+                <w:b/>
+                <w:bCs/>
+              </w:rPr>
+              <w:t>8-K Items 1.01/3.02 + S-3/S-3/A + 424B5</w:t>
+            </w:r>
+          </w:p>
+        </w:tc>
+        <w:tc>
+          <w:tcPr>
+            <w:tcW w:w="0" w:type="auto"/>
+            <w:tcBorders>
+              <w:top w:val="single" w:sz="2" w:space="0" w:color="2A2B2C"/>
+              <w:left w:val="single" w:sz="2" w:space="0" w:color="2A2B2C"/>
+              <w:bottom w:val="single" w:sz="2" w:space="0" w:color="2A2B2C"/>
+              <w:right w:val="single" w:sz="2" w:space="0" w:color="2A2B2C"/>
+            </w:tcBorders>
+            <w:shd w:val="clear" w:color="auto" w:fill="191A1B"/>
+            <w:tcMar>
+              <w:top w:w="30" w:type="dxa"/>
+              <w:left w:w="30" w:type="dxa"/>
+              <w:bottom w:w="30" w:type="dxa"/>
+              <w:right w:w="30" w:type="dxa"/>
+            </w:tcMar>
+            <w:vAlign w:val="center"/>
+            <w:hideMark/>
+          </w:tcPr>
+          <w:p>
+            <w:pPr>
+              <w:rPr>
+                <w:b/>
+                <w:bCs/>
+              </w:rPr>
+            </w:pPr>
+            <w:r>
+              <w:rPr>
+                <w:b/>
+                <w:bCs/>
+              </w:rPr>
+              <w:t>Capital raises: gross proceeds, price per share, shares issued, raise type (equity/debt/shelf/PFW). Plus shelf capacity = MAX(S-3 capacity) − SUM(424B5 draws) over trailing 3y</w:t>
+            </w:r>
+          </w:p>
+        </w:tc>
+        <w:tc>
+          <w:tcPr>
+            <w:tcW w:w="0" w:type="auto"/>
+            <w:tcBorders>
+              <w:top w:val="single" w:sz="2" w:space="0" w:color="2A2B2C"/>
+              <w:left w:val="single" w:sz="2" w:space="0" w:color="2A2B2C"/>
+              <w:bottom w:val="single" w:sz="2" w:space="0" w:color="2A2B2C"/>
+              <w:right w:val="single" w:sz="2" w:space="0" w:color="2A2B2C"/>
+            </w:tcBorders>
+            <w:shd w:val="clear" w:color="auto" w:fill="191A1B"/>
+            <w:tcMar>
+              <w:top w:w="30" w:type="dxa"/>
+              <w:left w:w="30" w:type="dxa"/>
+              <w:bottom w:w="30" w:type="dxa"/>
+              <w:right w:w="30" w:type="dxa"/>
+            </w:tcMar>
+            <w:vAlign w:val="center"/>
+            <w:hideMark/>
+          </w:tcPr>
+          <w:p>
+            <w:pPr>
+              <w:rPr>
+                <w:b/>
+                <w:bCs/>
+              </w:rPr>
+            </w:pPr>
+            <w:proofErr w:type="spellStart"/>
+            <w:r>
+              <w:rPr>
+                <w:b/>
+                <w:bCs/>
+              </w:rPr>
+              <w:t>capital_raises</w:t>
+            </w:r>
+            <w:proofErr w:type="spellEnd"/>
+          </w:p>
+        </w:tc>
+      </w:tr>
+    </w:tbl>
+    <w:p>
+      <w:pPr>
+        <w:rPr>
+          <w:b/>
+          <w:bCs/>
+        </w:rPr>
+      </w:pPr>
+      <w:r>
+        <w:rPr>
+          <w:b/>
+          <w:bCs/>
+        </w:rPr>
+        <w:lastRenderedPageBreak/>
+        <w:t xml:space="preserve">Each (ticker, source) write also leaves a row in </w:t>
+      </w:r>
+      <w:proofErr w:type="spellStart"/>
+      <w:r>
+        <w:rPr>
+          <w:b/>
+          <w:bCs/>
+        </w:rPr>
+        <w:t>fetch_log</w:t>
+      </w:r>
+      <w:proofErr w:type="spellEnd"/>
+      <w:r>
+        <w:rPr>
+          <w:b/>
+          <w:bCs/>
+        </w:rPr>
+        <w:t xml:space="preserve"> with timestamp, status (ok/partial/failed/</w:t>
+      </w:r>
+      <w:proofErr w:type="spellStart"/>
+      <w:r>
+        <w:rPr>
+          <w:b/>
+          <w:bCs/>
+        </w:rPr>
+        <w:t>skipped_non_biotech</w:t>
+      </w:r>
+      <w:proofErr w:type="spellEnd"/>
+      <w:r>
+        <w:rPr>
+          <w:b/>
+          <w:bCs/>
+        </w:rPr>
+        <w:t>), error text, and rows-written. That table drives idempotency.</w:t>
+      </w:r>
+    </w:p>
+    <w:p>
+      <w:pPr>
+        <w:rPr>
+          <w:b/>
+          <w:bCs/>
+        </w:rPr>
+      </w:pPr>
+      <w:r>
+        <w:rPr>
+          <w:b/>
+          <w:bCs/>
+        </w:rPr>
+        <w:t>What it deliberately does NOT do (per D54)</w:t>
+      </w:r>
+    </w:p>
+    <w:p>
+      <w:pPr>
+        <w:numPr>
+          <w:ilvl w:val="0"/>
+          <w:numId w:val="20"/>
+        </w:numPr>
+        <w:rPr>
+          <w:b/>
+          <w:bCs/>
+        </w:rPr>
+      </w:pPr>
+      <w:r>
+        <w:rPr>
+          <w:b/>
+          <w:bCs/>
+        </w:rPr>
+        <w:t>No clinical-trial data. No ClinicalTrials.gov calls. No interim/final readouts, no past-failures, no ongoing trials. M6's </w:t>
+      </w:r>
+      <w:proofErr w:type="spellStart"/>
+      <w:r>
+        <w:rPr>
+          <w:b/>
+          <w:bCs/>
+        </w:rPr>
+        <w:t>web_search</w:t>
+      </w:r>
+      <w:proofErr w:type="spellEnd"/>
+      <w:r>
+        <w:rPr>
+          <w:b/>
+          <w:bCs/>
+        </w:rPr>
+        <w:t> continues to handle clinical synthesis because:</w:t>
+      </w:r>
+    </w:p>
+    <w:p>
+      <w:pPr>
+        <w:numPr>
+          <w:ilvl w:val="1"/>
+          <w:numId w:val="20"/>
+        </w:numPr>
+        <w:rPr>
+          <w:b/>
+          <w:bCs/>
+        </w:rPr>
+      </w:pPr>
+      <w:r>
+        <w:rPr>
+          <w:b/>
+          <w:bCs/>
+        </w:rPr>
+        <w:t>M6 needs to weight multi-source coverage and check recency against IR press releases</w:t>
+      </w:r>
+    </w:p>
+    <w:p>
+      <w:pPr>
+        <w:numPr>
+          <w:ilvl w:val="1"/>
+          <w:numId w:val="20"/>
+        </w:numPr>
+        <w:rPr>
+          <w:b/>
+          <w:bCs/>
+        </w:rPr>
+      </w:pPr>
+      <w:r>
+        <w:rPr>
+          <w:b/>
+          <w:bCs/>
+        </w:rPr>
+        <w:t>Clinical interpretation needs mechanism context the LLM is better at</w:t>
+      </w:r>
+    </w:p>
+    <w:p>
+      <w:pPr>
+        <w:numPr>
+          <w:ilvl w:val="1"/>
+          <w:numId w:val="20"/>
+        </w:numPr>
+        <w:rPr>
+          <w:b/>
+          <w:bCs/>
+        </w:rPr>
+      </w:pPr>
+      <w:r>
+        <w:rPr>
+          <w:b/>
+          <w:bCs/>
+        </w:rPr>
+        <w:t>HARD RULE #19 requires citations inline in </w:t>
+      </w:r>
+      <w:proofErr w:type="spellStart"/>
+      <w:r>
+        <w:rPr>
+          <w:b/>
+          <w:bCs/>
+        </w:rPr>
+        <w:t>final_results</w:t>
+      </w:r>
+      <w:proofErr w:type="spellEnd"/>
+      <w:r>
+        <w:rPr>
+          <w:b/>
+          <w:bCs/>
+        </w:rPr>
+        <w:t>[]/</w:t>
+      </w:r>
+      <w:proofErr w:type="spellStart"/>
+      <w:r>
+        <w:rPr>
+          <w:b/>
+          <w:bCs/>
+        </w:rPr>
+        <w:t>interim_results</w:t>
+      </w:r>
+      <w:proofErr w:type="spellEnd"/>
+      <w:r>
+        <w:rPr>
+          <w:b/>
+          <w:bCs/>
+        </w:rPr>
+        <w:t>[] arrays</w:t>
+      </w:r>
+    </w:p>
+    <w:p>
+      <w:pPr>
+        <w:numPr>
+          <w:ilvl w:val="0"/>
+          <w:numId w:val="20"/>
+        </w:numPr>
+        <w:rPr>
+          <w:b/>
+          <w:bCs/>
+        </w:rPr>
+      </w:pPr>
+      <w:r>
+        <w:rPr>
+          <w:b/>
+          <w:bCs/>
+        </w:rPr>
+        <w:t>No paid data providers. SEC is free, deterministic, audit-able.</w:t>
+      </w:r>
+    </w:p>
+    <w:p>
+      <w:pPr>
+        <w:numPr>
+          <w:ilvl w:val="0"/>
+          <w:numId w:val="20"/>
+        </w:numPr>
+        <w:rPr>
+          <w:b/>
+          <w:bCs/>
+        </w:rPr>
+      </w:pPr>
+      <w:r>
+        <w:rPr>
+          <w:b/>
+          <w:bCs/>
+        </w:rPr>
+        <w:t>No non-biotech tickers. Industries gated to Biotechnology / Drug Manufacturers - Specialty &amp; Generic / Drug Manufacturers - General. Other tickers are logged as </w:t>
+      </w:r>
+      <w:proofErr w:type="spellStart"/>
+      <w:r>
+        <w:rPr>
+          <w:b/>
+          <w:bCs/>
+        </w:rPr>
+        <w:t>skipped_non_biotech</w:t>
+      </w:r>
+      <w:proofErr w:type="spellEnd"/>
+      <w:r>
+        <w:rPr>
+          <w:b/>
+          <w:bCs/>
+        </w:rPr>
+        <w:t xml:space="preserve">; M5 emits packs without the fundamentals block; M6 falls back to </w:t>
+      </w:r>
+      <w:proofErr w:type="spellStart"/>
+      <w:r>
+        <w:rPr>
+          <w:b/>
+          <w:bCs/>
+        </w:rPr>
+        <w:t>web_search</w:t>
+      </w:r>
+      <w:proofErr w:type="spellEnd"/>
+      <w:r>
+        <w:rPr>
+          <w:b/>
+          <w:bCs/>
+        </w:rPr>
+        <w:t xml:space="preserve"> for them.</w:t>
+      </w:r>
+    </w:p>
+    <w:p>
+      <w:pPr>
+        <w:rPr>
+          <w:b/>
+          <w:bCs/>
+        </w:rPr>
+      </w:pPr>
+      <w:r>
+        <w:rPr>
+          <w:b/>
+          <w:bCs/>
+        </w:rPr>
+        <w:t>How it's gated (so re-runs are cheap)</w:t>
+      </w:r>
+    </w:p>
+    <w:p>
+      <w:pPr>
+        <w:rPr>
+          <w:b/>
+          <w:bCs/>
+        </w:rPr>
+      </w:pPr>
+      <w:r>
+        <w:rPr>
+          <w:b/>
+          <w:bCs/>
+        </w:rPr>
+        <w:t xml:space="preserve">Per-(ticker, source) TTL, mirroring M4a's </w:t>
+      </w:r>
+      <w:proofErr w:type="spellStart"/>
+      <w:r>
+        <w:rPr>
+          <w:b/>
+          <w:bCs/>
+        </w:rPr>
+        <w:t>ticker_snapshot.fetched_at</w:t>
+      </w:r>
+      <w:proofErr w:type="spellEnd"/>
+      <w:r>
+        <w:rPr>
+          <w:b/>
+          <w:bCs/>
+        </w:rPr>
+        <w:t xml:space="preserve"> + 7d pattern:</w:t>
+      </w:r>
+    </w:p>
+    <w:tbl>
+      <w:tblPr>
+        <w:tblW w:w="0" w:type="auto"/>
+        <w:tblBorders>
+          <w:top w:val="single" w:sz="2" w:space="0" w:color="2A2B2C"/>
+          <w:left w:val="single" w:sz="2" w:space="0" w:color="2A2B2C"/>
+          <w:bottom w:val="single" w:sz="2" w:space="0" w:color="2A2B2C"/>
+          <w:right w:val="single" w:sz="2" w:space="0" w:color="2A2B2C"/>
+        </w:tblBorders>
+        <w:shd w:val="clear" w:color="auto" w:fill="191A1B"/>
+        <w:tblCellMar>
+          <w:top w:w="15" w:type="dxa"/>
+          <w:left w:w="15" w:type="dxa"/>
+          <w:bottom w:w="15" w:type="dxa"/>
+          <w:right w:w="15" w:type="dxa"/>
+        </w:tblCellMar>
+        <w:tblLook w:val="04A0" w:firstRow="1" w:lastRow="0" w:firstColumn="1" w:lastColumn="0" w:noHBand="0" w:noVBand="1"/>
+      </w:tblPr>
+      <w:tblGrid>
+        <w:gridCol w:w="1325"/>
+        <w:gridCol w:w="1537"/>
+        <w:gridCol w:w="6158"/>
+      </w:tblGrid>
+      <w:tr>
+        <w:trPr>
+          <w:tblHeader/>
+        </w:trPr>
+        <w:tc>
+          <w:tcPr>
+            <w:tcW w:w="0" w:type="auto"/>
+            <w:tcBorders>
+              <w:top w:val="single" w:sz="2" w:space="0" w:color="2A2B2C"/>
+              <w:left w:val="single" w:sz="2" w:space="0" w:color="2A2B2C"/>
+              <w:bottom w:val="single" w:sz="2" w:space="0" w:color="2A2B2C"/>
+              <w:right w:val="single" w:sz="2" w:space="0" w:color="2A2B2C"/>
+            </w:tcBorders>
+            <w:shd w:val="clear" w:color="auto" w:fill="191A1B"/>
+            <w:tcMar>
+              <w:top w:w="30" w:type="dxa"/>
+              <w:left w:w="30" w:type="dxa"/>
+              <w:bottom w:w="30" w:type="dxa"/>
+              <w:right w:w="30" w:type="dxa"/>
+            </w:tcMar>
+            <w:vAlign w:val="center"/>
+            <w:hideMark/>
+          </w:tcPr>
+          <w:p>
+            <w:pPr>
+              <w:rPr>
+                <w:b/>
+                <w:bCs/>
+              </w:rPr>
+            </w:pPr>
+            <w:r>
+              <w:rPr>
+                <w:b/>
+                <w:bCs/>
+              </w:rPr>
+              <w:t>Source</w:t>
             </w:r>
           </w:p>
         </w:tc>
@@ -396,7 +1434,7 @@
                 <w:b/>
                 <w:bCs/>
               </w:rPr>
-              <w:t>Goes into</w:t>
+              <w:t>Notes</w:t>
             </w:r>
           </w:p>
         </w:tc>
@@ -422,8 +1460,18 @@
             <w:hideMark/>
           </w:tcPr>
           <w:p>
+            <w:pPr>
+              <w:rPr>
+                <w:b/>
+                <w:bCs/>
+              </w:rPr>
+            </w:pPr>
             <w:proofErr w:type="spellStart"/>
             <w:r>
+              <w:rPr>
+                <w:b/>
+                <w:bCs/>
+              </w:rPr>
               <w:t>companyfacts</w:t>
             </w:r>
             <w:proofErr w:type="spellEnd"/>
@@ -449,61 +1497,17 @@
             <w:hideMark/>
           </w:tcPr>
           <w:p>
+            <w:pPr>
+              <w:rPr>
+                <w:b/>
+                <w:bCs/>
+              </w:rPr>
+            </w:pPr>
             <w:r>
-              <w:t>XBRL: cash, ST investments, total assets/</w:t>
-            </w:r>
-            <w:proofErr w:type="spellStart"/>
-            <w:r>
-              <w:t>liabs</w:t>
-            </w:r>
-            <w:proofErr w:type="spellEnd"/>
-            <w:r>
-              <w:t>, AR, PP&amp;E, R&amp;D TTM, G&amp;A TTM, op CF TTM, common shares outstanding. Computes </w:t>
-            </w:r>
-            <w:proofErr w:type="spellStart"/>
-            <w:r>
-              <w:t>cash_total_usd</w:t>
-            </w:r>
-            <w:proofErr w:type="spellEnd"/>
-            <w:r>
-              <w:t>, </w:t>
-            </w:r>
-            <w:proofErr w:type="spellStart"/>
-            <w:r>
-              <w:t>quarterly_burn_usd</w:t>
-            </w:r>
-            <w:proofErr w:type="spellEnd"/>
-            <w:r>
-              <w:t>, </w:t>
-            </w:r>
-            <w:proofErr w:type="spellStart"/>
-            <w:r>
-              <w:t>runway_months</w:t>
-            </w:r>
-            <w:proofErr w:type="spellEnd"/>
-          </w:p>
-        </w:tc>
-        <w:tc>
-          <w:tcPr>
-            <w:tcW w:w="0" w:type="auto"/>
-            <w:tcBorders>
-              <w:top w:val="single" w:sz="2" w:space="0" w:color="2A2B2C"/>
-              <w:left w:val="single" w:sz="2" w:space="0" w:color="2A2B2C"/>
-              <w:bottom w:val="single" w:sz="2" w:space="0" w:color="2A2B2C"/>
-              <w:right w:val="single" w:sz="2" w:space="0" w:color="2A2B2C"/>
-            </w:tcBorders>
-            <w:shd w:val="clear" w:color="auto" w:fill="191A1B"/>
-            <w:tcMar>
-              <w:top w:w="30" w:type="dxa"/>
-              <w:left w:w="30" w:type="dxa"/>
-              <w:bottom w:w="30" w:type="dxa"/>
-              <w:right w:w="30" w:type="dxa"/>
-            </w:tcMar>
-            <w:vAlign w:val="center"/>
-            <w:hideMark/>
-          </w:tcPr>
-          <w:p>
-            <w:r>
+              <w:rPr>
+                <w:b/>
+                <w:bCs/>
+              </w:rPr>
               <w:t>30d</w:t>
             </w:r>
           </w:p>
@@ -528,8 +1532,18 @@
             <w:hideMark/>
           </w:tcPr>
           <w:p>
+            <w:pPr>
+              <w:rPr>
+                <w:b/>
+                <w:bCs/>
+              </w:rPr>
+            </w:pPr>
             <w:r>
-              <w:t>financials table</w:t>
+              <w:rPr>
+                <w:b/>
+                <w:bCs/>
+              </w:rPr>
+              <w:t>Re-fetches the full XBRL JSON</w:t>
             </w:r>
           </w:p>
         </w:tc>
@@ -555,7 +1569,17 @@
             <w:hideMark/>
           </w:tcPr>
           <w:p>
+            <w:pPr>
+              <w:rPr>
+                <w:b/>
+                <w:bCs/>
+              </w:rPr>
+            </w:pPr>
             <w:r>
+              <w:rPr>
+                <w:b/>
+                <w:bCs/>
+              </w:rPr>
               <w:t>submissions</w:t>
             </w:r>
           </w:p>
@@ -580,32 +1604,17 @@
             <w:hideMark/>
           </w:tcPr>
           <w:p>
+            <w:pPr>
+              <w:rPr>
+                <w:b/>
+                <w:bCs/>
+              </w:rPr>
+            </w:pPr>
             <w:r>
-              <w:t>Recent filings list filtered to forms {4, 8-K, S-3, S-3/A, 424B5}. Discovery only — feeds the next two workers.</w:t>
-            </w:r>
-          </w:p>
-        </w:tc>
-        <w:tc>
-          <w:tcPr>
-            <w:tcW w:w="0" w:type="auto"/>
-            <w:tcBorders>
-              <w:top w:val="single" w:sz="2" w:space="0" w:color="2A2B2C"/>
-              <w:left w:val="single" w:sz="2" w:space="0" w:color="2A2B2C"/>
-              <w:bottom w:val="single" w:sz="2" w:space="0" w:color="2A2B2C"/>
-              <w:right w:val="single" w:sz="2" w:space="0" w:color="2A2B2C"/>
-            </w:tcBorders>
-            <w:shd w:val="clear" w:color="auto" w:fill="191A1B"/>
-            <w:tcMar>
-              <w:top w:w="30" w:type="dxa"/>
-              <w:left w:w="30" w:type="dxa"/>
-              <w:bottom w:w="30" w:type="dxa"/>
-              <w:right w:w="30" w:type="dxa"/>
-            </w:tcMar>
-            <w:vAlign w:val="center"/>
-            <w:hideMark/>
-          </w:tcPr>
-          <w:p>
-            <w:r>
+              <w:rPr>
+                <w:b/>
+                <w:bCs/>
+              </w:rPr>
               <w:t>7d</w:t>
             </w:r>
           </w:p>
@@ -630,8 +1639,18 @@
             <w:hideMark/>
           </w:tcPr>
           <w:p>
+            <w:pPr>
+              <w:rPr>
+                <w:b/>
+                <w:bCs/>
+              </w:rPr>
+            </w:pPr>
             <w:r>
-              <w:t>(no rows of its own)</w:t>
+              <w:rPr>
+                <w:b/>
+                <w:bCs/>
+              </w:rPr>
+              <w:t>Cheap; one filings-list JSON</w:t>
             </w:r>
           </w:p>
         </w:tc>
@@ -657,7 +1676,17 @@
             <w:hideMark/>
           </w:tcPr>
           <w:p>
+            <w:pPr>
+              <w:rPr>
+                <w:b/>
+                <w:bCs/>
+              </w:rPr>
+            </w:pPr>
             <w:r>
+              <w:rPr>
+                <w:b/>
+                <w:bCs/>
+              </w:rPr>
               <w:t>form4</w:t>
             </w:r>
           </w:p>
@@ -682,40 +1711,18 @@
             <w:hideMark/>
           </w:tcPr>
           <w:p>
+            <w:pPr>
+              <w:rPr>
+                <w:b/>
+                <w:bCs/>
+              </w:rPr>
+            </w:pPr>
             <w:r>
-              <w:t xml:space="preserve">Per filing: fetches the OWNERSHIP DOCUMENT XML (raw, not the XSLT-rendered HTML), parses every transaction line into (insider, role, </w:t>
-            </w:r>
-            <w:proofErr w:type="spellStart"/>
-            <w:r>
-              <w:t>txn_type</w:t>
-            </w:r>
-            <w:proofErr w:type="spellEnd"/>
-            <w:r>
-              <w:t xml:space="preserve">, shares, price, date). Classifies role (CEO/CFO/Director/10% owner/Officer/Other) and </w:t>
-            </w:r>
-            <w:proofErr w:type="spellStart"/>
-            <w:r>
-              <w:t>txn_type</w:t>
-            </w:r>
-            <w:proofErr w:type="spellEnd"/>
-            <w:r>
-              <w:t xml:space="preserve"> (buy/sell/</w:t>
-            </w:r>
-            <w:proofErr w:type="spellStart"/>
-            <w:r>
-              <w:t>option_exercise</w:t>
-            </w:r>
-            <w:proofErr w:type="spellEnd"/>
-            <w:r>
-              <w:t>/</w:t>
-            </w:r>
-            <w:proofErr w:type="spellStart"/>
-            <w:r>
-              <w:t>option_grant</w:t>
-            </w:r>
-            <w:proofErr w:type="spellEnd"/>
-            <w:r>
-              <w:t>/gift/other).</w:t>
+              <w:rPr>
+                <w:b/>
+                <w:bCs/>
+              </w:rPr>
+              <w:t>30d (poll cadence)</w:t>
             </w:r>
           </w:p>
         </w:tc>
@@ -739,38 +1746,34 @@
             <w:hideMark/>
           </w:tcPr>
           <w:p>
+            <w:pPr>
+              <w:rPr>
+                <w:b/>
+                <w:bCs/>
+              </w:rPr>
+            </w:pPr>
             <w:r>
-              <w:t>append-only</w:t>
+              <w:rPr>
+                <w:b/>
+                <w:bCs/>
+              </w:rPr>
+              <w:t>Append-only by </w:t>
             </w:r>
-          </w:p>
-        </w:tc>
-        <w:tc>
-          <w:tcPr>
-            <w:tcW w:w="0" w:type="auto"/>
-            <w:tcBorders>
-              <w:top w:val="single" w:sz="2" w:space="0" w:color="2A2B2C"/>
-              <w:left w:val="single" w:sz="2" w:space="0" w:color="2A2B2C"/>
-              <w:bottom w:val="single" w:sz="2" w:space="0" w:color="2A2B2C"/>
-              <w:right w:val="single" w:sz="2" w:space="0" w:color="2A2B2C"/>
-            </w:tcBorders>
-            <w:shd w:val="clear" w:color="auto" w:fill="191A1B"/>
-            <w:tcMar>
-              <w:top w:w="30" w:type="dxa"/>
-              <w:left w:w="30" w:type="dxa"/>
-              <w:bottom w:w="30" w:type="dxa"/>
-              <w:right w:w="30" w:type="dxa"/>
-            </w:tcMar>
-            <w:vAlign w:val="center"/>
-            <w:hideMark/>
-          </w:tcPr>
-          <w:p>
             <w:proofErr w:type="spellStart"/>
             <w:r>
-              <w:t>insider_transactions</w:t>
+              <w:rPr>
+                <w:b/>
+                <w:bCs/>
+              </w:rPr>
+              <w:t>accession_number</w:t>
             </w:r>
             <w:proofErr w:type="spellEnd"/>
             <w:r>
-              <w:t> table</w:t>
+              <w:rPr>
+                <w:b/>
+                <w:bCs/>
+              </w:rPr>
+              <w:t> — only new filings since last run get fetched</w:t>
             </w:r>
           </w:p>
         </w:tc>
@@ -796,8 +1799,18 @@
             <w:hideMark/>
           </w:tcPr>
           <w:p>
+            <w:pPr>
+              <w:rPr>
+                <w:b/>
+                <w:bCs/>
+              </w:rPr>
+            </w:pPr>
             <w:proofErr w:type="spellStart"/>
             <w:r>
+              <w:rPr>
+                <w:b/>
+                <w:bCs/>
+              </w:rPr>
               <w:t>capital_raises</w:t>
             </w:r>
             <w:proofErr w:type="spellEnd"/>
@@ -823,20 +1836,18 @@
             <w:hideMark/>
           </w:tcPr>
           <w:p>
+            <w:pPr>
+              <w:rPr>
+                <w:b/>
+                <w:bCs/>
+              </w:rPr>
+            </w:pPr>
             <w:r>
-              <w:t>Per 8-K / S-3 / 424B5 filing: fetches the primary document, regex-extracts gross proceeds + price per share + raise type (</w:t>
-            </w:r>
-            <w:proofErr w:type="spellStart"/>
-            <w:r>
-              <w:t>pfw</w:t>
-            </w:r>
-            <w:proofErr w:type="spellEnd"/>
-            <w:r>
-              <w:t xml:space="preserve">/equity/debt/shelf/unknown). </w:t>
-            </w:r>
-            <w:r>
-              <w:lastRenderedPageBreak/>
-              <w:t>Audit-quality (regex hit rate is poor — partial state with raw filing URL preserved).</w:t>
+              <w:rPr>
+                <w:b/>
+                <w:bCs/>
+              </w:rPr>
+              <w:t>30d (poll cadence)</w:t>
             </w:r>
           </w:p>
         </w:tc>
@@ -860,9 +1871,247 @@
             <w:hideMark/>
           </w:tcPr>
           <w:p>
+            <w:pPr>
+              <w:rPr>
+                <w:b/>
+                <w:bCs/>
+              </w:rPr>
+            </w:pPr>
             <w:r>
+              <w:rPr>
+                <w:b/>
+                <w:bCs/>
+              </w:rPr>
+              <w:t>Same append-only semantics</w:t>
+            </w:r>
+          </w:p>
+        </w:tc>
+      </w:tr>
+    </w:tbl>
+    <w:p>
+      <w:pPr>
+        <w:rPr>
+          <w:b/>
+          <w:bCs/>
+        </w:rPr>
+      </w:pPr>
+      <w:r>
+        <w:rPr>
+          <w:b/>
+          <w:bCs/>
+        </w:rPr>
+        <w:t>Plus a --force-refresh flag bypasses TTLs entirely. Today's smoke test (3 tickers TTL-fresh) ran in 0.0 s.</w:t>
+      </w:r>
+    </w:p>
+    <w:p>
+      <w:pPr>
+        <w:rPr>
+          <w:b/>
+          <w:bCs/>
+        </w:rPr>
+      </w:pPr>
+      <w:r>
+        <w:rPr>
+          <w:b/>
+          <w:bCs/>
+        </w:rPr>
+        <w:t>Why this exists (the actual value-add)</w:t>
+      </w:r>
+    </w:p>
+    <w:p>
+      <w:pPr>
+        <w:rPr>
+          <w:b/>
+          <w:bCs/>
+        </w:rPr>
+      </w:pPr>
+      <w:r>
+        <w:rPr>
+          <w:b/>
+          <w:bCs/>
+        </w:rPr>
+        <w:t>Three things the LLM can't do reliably:</w:t>
+      </w:r>
+    </w:p>
+    <w:p>
+      <w:pPr>
+        <w:numPr>
+          <w:ilvl w:val="0"/>
+          <w:numId w:val="21"/>
+        </w:numPr>
+        <w:rPr>
+          <w:b/>
+          <w:bCs/>
+        </w:rPr>
+      </w:pPr>
+      <w:r>
+        <w:rPr>
+          <w:b/>
+          <w:bCs/>
+        </w:rPr>
+        <w:t>Determinism. XBRL pinned to a specific period-end-date doesn't drift run-to-run. Early m6-v3 runs occasionally hallucinated runway months by ±20%.</w:t>
+      </w:r>
+    </w:p>
+    <w:p>
+      <w:pPr>
+        <w:numPr>
+          <w:ilvl w:val="0"/>
+          <w:numId w:val="21"/>
+        </w:numPr>
+        <w:rPr>
+          <w:b/>
+          <w:bCs/>
+        </w:rPr>
+      </w:pPr>
+      <w:r>
+        <w:rPr>
+          <w:b/>
+          <w:bCs/>
+        </w:rPr>
+        <w:t>Audit-ability. Every number traces to a SEC filing accession + form + period. The whole </w:t>
+      </w:r>
+      <w:proofErr w:type="spellStart"/>
+      <w:r>
+        <w:rPr>
+          <w:b/>
+          <w:bCs/>
+        </w:rPr>
+        <w:t>fetch_log</w:t>
+      </w:r>
+      <w:proofErr w:type="spellEnd"/>
+      <w:r>
+        <w:rPr>
+          <w:b/>
+          <w:bCs/>
+        </w:rPr>
+        <w:t xml:space="preserve"> is </w:t>
+      </w:r>
+      <w:proofErr w:type="spellStart"/>
+      <w:r>
+        <w:rPr>
+          <w:b/>
+          <w:bCs/>
+        </w:rPr>
+        <w:t>queryable</w:t>
+      </w:r>
+      <w:proofErr w:type="spellEnd"/>
+      <w:r>
+        <w:rPr>
+          <w:b/>
+          <w:bCs/>
+        </w:rPr>
+        <w:t>.</w:t>
+      </w:r>
+    </w:p>
+    <w:p>
+      <w:pPr>
+        <w:numPr>
+          <w:ilvl w:val="0"/>
+          <w:numId w:val="21"/>
+        </w:numPr>
+        <w:rPr>
+          <w:b/>
+          <w:bCs/>
+        </w:rPr>
+      </w:pPr>
+      <w:r>
+        <w:rPr>
+          <w:b/>
+          <w:bCs/>
+        </w:rPr>
+        <w:t>Cost shift. </w:t>
+      </w:r>
+      <w:del w:id="0" w:author="Unknown">
+        <w:r>
+          <w:rPr>
+            <w:b/>
+            <w:bCs/>
+          </w:rPr>
+          <w:delText>20% reduction in M6 dispatch cost per ticker (</w:delText>
+        </w:r>
+      </w:del>
+      <w:r>
+        <w:rPr>
+          <w:b/>
+          <w:bCs/>
+        </w:rPr>
+        <w:t>$0.95 → ~$0.78 cold cache). Modest by itself, but compounds with batch mode and prompt caching.</w:t>
+      </w:r>
+    </w:p>
+    <w:p>
+      <w:pPr>
+        <w:rPr>
+          <w:b/>
+          <w:bCs/>
+        </w:rPr>
+      </w:pPr>
+      <w:r>
+        <w:rPr>
+          <w:b/>
+          <w:bCs/>
+        </w:rPr>
+        <w:t>What lives where</w:t>
+      </w:r>
+    </w:p>
+    <w:tbl>
+      <w:tblPr>
+        <w:tblW w:w="0" w:type="auto"/>
+        <w:tblBorders>
+          <w:top w:val="single" w:sz="2" w:space="0" w:color="2A2B2C"/>
+          <w:left w:val="single" w:sz="2" w:space="0" w:color="2A2B2C"/>
+          <w:bottom w:val="single" w:sz="2" w:space="0" w:color="2A2B2C"/>
+          <w:right w:val="single" w:sz="2" w:space="0" w:color="2A2B2C"/>
+        </w:tblBorders>
+        <w:shd w:val="clear" w:color="auto" w:fill="191A1B"/>
+        <w:tblCellMar>
+          <w:top w:w="15" w:type="dxa"/>
+          <w:left w:w="15" w:type="dxa"/>
+          <w:bottom w:w="15" w:type="dxa"/>
+          <w:right w:w="15" w:type="dxa"/>
+        </w:tblCellMar>
+        <w:tblLook w:val="04A0" w:firstRow="1" w:lastRow="0" w:firstColumn="1" w:lastColumn="0" w:noHBand="0" w:noVBand="1"/>
+      </w:tblPr>
+      <w:tblGrid>
+        <w:gridCol w:w="3404"/>
+        <w:gridCol w:w="5616"/>
+      </w:tblGrid>
+      <w:tr>
+        <w:trPr>
+          <w:tblHeader/>
+        </w:trPr>
+        <w:tc>
+          <w:tcPr>
+            <w:tcW w:w="0" w:type="auto"/>
+            <w:tcBorders>
+              <w:top w:val="single" w:sz="2" w:space="0" w:color="2A2B2C"/>
+              <w:left w:val="single" w:sz="2" w:space="0" w:color="2A2B2C"/>
+              <w:bottom w:val="single" w:sz="2" w:space="0" w:color="2A2B2C"/>
+              <w:right w:val="single" w:sz="2" w:space="0" w:color="2A2B2C"/>
+            </w:tcBorders>
+            <w:shd w:val="clear" w:color="auto" w:fill="191A1B"/>
+            <w:tcMar>
+              <w:top w:w="30" w:type="dxa"/>
+              <w:left w:w="30" w:type="dxa"/>
+              <w:bottom w:w="30" w:type="dxa"/>
+              <w:right w:w="30" w:type="dxa"/>
+            </w:tcMar>
+            <w:vAlign w:val="center"/>
+            <w:hideMark/>
+          </w:tcPr>
+          <w:p>
+            <w:pPr>
+              <w:rPr>
+                <w:b/>
+                <w:bCs/>
+              </w:rPr>
+            </w:pPr>
+            <w:r>
+              <w:rPr>
+                <w:b/>
+                <w:bCs/>
+              </w:rPr>
               <w:lastRenderedPageBreak/>
-              <w:t>append-only</w:t>
+              <w:t>File</w:t>
             </w:r>
           </w:p>
         </w:tc>
@@ -886,806 +2135,1005 @@
             <w:hideMark/>
           </w:tcPr>
           <w:p>
+            <w:pPr>
+              <w:rPr>
+                <w:b/>
+                <w:bCs/>
+              </w:rPr>
+            </w:pPr>
+            <w:r>
+              <w:rPr>
+                <w:b/>
+                <w:bCs/>
+              </w:rPr>
+              <w:t>Role</w:t>
+            </w:r>
+          </w:p>
+        </w:tc>
+      </w:tr>
+      <w:tr>
+        <w:tc>
+          <w:tcPr>
+            <w:tcW w:w="0" w:type="auto"/>
+            <w:tcBorders>
+              <w:top w:val="single" w:sz="2" w:space="0" w:color="2A2B2C"/>
+              <w:left w:val="single" w:sz="2" w:space="0" w:color="2A2B2C"/>
+              <w:bottom w:val="single" w:sz="2" w:space="0" w:color="2A2B2C"/>
+              <w:right w:val="single" w:sz="2" w:space="0" w:color="2A2B2C"/>
+            </w:tcBorders>
+            <w:shd w:val="clear" w:color="auto" w:fill="191A1B"/>
+            <w:tcMar>
+              <w:top w:w="30" w:type="dxa"/>
+              <w:left w:w="30" w:type="dxa"/>
+              <w:bottom w:w="30" w:type="dxa"/>
+              <w:right w:w="30" w:type="dxa"/>
+            </w:tcMar>
+            <w:vAlign w:val="center"/>
+            <w:hideMark/>
+          </w:tcPr>
+          <w:p>
+            <w:pPr>
+              <w:rPr>
+                <w:b/>
+                <w:bCs/>
+                <w:lang w:val="fr-FR"/>
+              </w:rPr>
+            </w:pPr>
+            <w:hyperlink r:id="rId5" w:tgtFrame="_blank" w:history="1">
+              <w:r>
+                <w:rPr>
+                  <w:rStyle w:val="Hyperlink"/>
+                  <w:b/>
+                  <w:bCs/>
+                  <w:lang w:val="fr-FR"/>
+                </w:rPr>
+                <w:t>src/module_4c/enrich.py</w:t>
+              </w:r>
+            </w:hyperlink>
+          </w:p>
+        </w:tc>
+        <w:tc>
+          <w:tcPr>
+            <w:tcW w:w="0" w:type="auto"/>
+            <w:tcBorders>
+              <w:top w:val="single" w:sz="2" w:space="0" w:color="2A2B2C"/>
+              <w:left w:val="single" w:sz="2" w:space="0" w:color="2A2B2C"/>
+              <w:bottom w:val="single" w:sz="2" w:space="0" w:color="2A2B2C"/>
+              <w:right w:val="single" w:sz="2" w:space="0" w:color="2A2B2C"/>
+            </w:tcBorders>
+            <w:shd w:val="clear" w:color="auto" w:fill="191A1B"/>
+            <w:tcMar>
+              <w:top w:w="30" w:type="dxa"/>
+              <w:left w:w="30" w:type="dxa"/>
+              <w:bottom w:w="30" w:type="dxa"/>
+              <w:right w:w="30" w:type="dxa"/>
+            </w:tcMar>
+            <w:vAlign w:val="center"/>
+            <w:hideMark/>
+          </w:tcPr>
+          <w:p>
+            <w:pPr>
+              <w:rPr>
+                <w:b/>
+                <w:bCs/>
+              </w:rPr>
+            </w:pPr>
+            <w:r>
+              <w:rPr>
+                <w:b/>
+                <w:bCs/>
+              </w:rPr>
+              <w:t xml:space="preserve">Top-level orchestrator; per-ticker × per-source TTL gating; </w:t>
+            </w:r>
             <w:proofErr w:type="spellStart"/>
             <w:r>
-              <w:t>capital_raises</w:t>
+              <w:rPr>
+                <w:b/>
+                <w:bCs/>
+              </w:rPr>
+              <w:t>threadpool</w:t>
             </w:r>
             <w:proofErr w:type="spellEnd"/>
             <w:r>
-              <w:t> table</w:t>
+              <w:rPr>
+                <w:b/>
+                <w:bCs/>
+              </w:rPr>
+              <w:t xml:space="preserve"> (D56)</w:t>
+            </w:r>
+          </w:p>
+        </w:tc>
+      </w:tr>
+      <w:tr>
+        <w:tc>
+          <w:tcPr>
+            <w:tcW w:w="0" w:type="auto"/>
+            <w:tcBorders>
+              <w:top w:val="single" w:sz="2" w:space="0" w:color="2A2B2C"/>
+              <w:left w:val="single" w:sz="2" w:space="0" w:color="2A2B2C"/>
+              <w:bottom w:val="single" w:sz="2" w:space="0" w:color="2A2B2C"/>
+              <w:right w:val="single" w:sz="2" w:space="0" w:color="2A2B2C"/>
+            </w:tcBorders>
+            <w:shd w:val="clear" w:color="auto" w:fill="191A1B"/>
+            <w:tcMar>
+              <w:top w:w="30" w:type="dxa"/>
+              <w:left w:w="30" w:type="dxa"/>
+              <w:bottom w:w="30" w:type="dxa"/>
+              <w:right w:w="30" w:type="dxa"/>
+            </w:tcMar>
+            <w:vAlign w:val="center"/>
+            <w:hideMark/>
+          </w:tcPr>
+          <w:p>
+            <w:pPr>
+              <w:rPr>
+                <w:b/>
+                <w:bCs/>
+              </w:rPr>
+            </w:pPr>
+            <w:hyperlink r:id="rId6" w:tgtFrame="_blank" w:history="1">
+              <w:r>
+                <w:rPr>
+                  <w:rStyle w:val="Hyperlink"/>
+                  <w:b/>
+                  <w:bCs/>
+                </w:rPr>
+                <w:t>src/module_4c/edgar_client.py</w:t>
+              </w:r>
+            </w:hyperlink>
+          </w:p>
+        </w:tc>
+        <w:tc>
+          <w:tcPr>
+            <w:tcW w:w="0" w:type="auto"/>
+            <w:tcBorders>
+              <w:top w:val="single" w:sz="2" w:space="0" w:color="2A2B2C"/>
+              <w:left w:val="single" w:sz="2" w:space="0" w:color="2A2B2C"/>
+              <w:bottom w:val="single" w:sz="2" w:space="0" w:color="2A2B2C"/>
+              <w:right w:val="single" w:sz="2" w:space="0" w:color="2A2B2C"/>
+            </w:tcBorders>
+            <w:shd w:val="clear" w:color="auto" w:fill="191A1B"/>
+            <w:tcMar>
+              <w:top w:w="30" w:type="dxa"/>
+              <w:left w:w="30" w:type="dxa"/>
+              <w:bottom w:w="30" w:type="dxa"/>
+              <w:right w:w="30" w:type="dxa"/>
+            </w:tcMar>
+            <w:vAlign w:val="center"/>
+            <w:hideMark/>
+          </w:tcPr>
+          <w:p>
+            <w:pPr>
+              <w:rPr>
+                <w:b/>
+                <w:bCs/>
+              </w:rPr>
+            </w:pPr>
+            <w:r>
+              <w:rPr>
+                <w:b/>
+                <w:bCs/>
+              </w:rPr>
+              <w:t xml:space="preserve">All SEC HTTP — </w:t>
+            </w:r>
+            <w:proofErr w:type="spellStart"/>
+            <w:r>
+              <w:rPr>
+                <w:b/>
+                <w:bCs/>
+              </w:rPr>
+              <w:t>companyfacts</w:t>
+            </w:r>
+            <w:proofErr w:type="spellEnd"/>
+            <w:r>
+              <w:rPr>
+                <w:b/>
+                <w:bCs/>
+              </w:rPr>
+              <w:t>/submissions/Form 4/capital raises; shared </w:t>
+            </w:r>
+            <w:proofErr w:type="spellStart"/>
+            <w:r>
+              <w:rPr>
+                <w:b/>
+                <w:bCs/>
+              </w:rPr>
+              <w:t>requests.Session</w:t>
+            </w:r>
+            <w:proofErr w:type="spellEnd"/>
+            <w:r>
+              <w:rPr>
+                <w:b/>
+                <w:bCs/>
+              </w:rPr>
+              <w:t xml:space="preserve">; rate-limited via _EDGAR_LIMITER (9.5 </w:t>
+            </w:r>
+            <w:proofErr w:type="spellStart"/>
+            <w:r>
+              <w:rPr>
+                <w:b/>
+                <w:bCs/>
+              </w:rPr>
+              <w:t>req</w:t>
+            </w:r>
+            <w:proofErr w:type="spellEnd"/>
+            <w:r>
+              <w:rPr>
+                <w:b/>
+                <w:bCs/>
+              </w:rPr>
+              <w:t>/s)</w:t>
+            </w:r>
+          </w:p>
+        </w:tc>
+      </w:tr>
+      <w:tr>
+        <w:tc>
+          <w:tcPr>
+            <w:tcW w:w="0" w:type="auto"/>
+            <w:tcBorders>
+              <w:top w:val="single" w:sz="2" w:space="0" w:color="2A2B2C"/>
+              <w:left w:val="single" w:sz="2" w:space="0" w:color="2A2B2C"/>
+              <w:bottom w:val="single" w:sz="2" w:space="0" w:color="2A2B2C"/>
+              <w:right w:val="single" w:sz="2" w:space="0" w:color="2A2B2C"/>
+            </w:tcBorders>
+            <w:shd w:val="clear" w:color="auto" w:fill="191A1B"/>
+            <w:tcMar>
+              <w:top w:w="30" w:type="dxa"/>
+              <w:left w:w="30" w:type="dxa"/>
+              <w:bottom w:w="30" w:type="dxa"/>
+              <w:right w:w="30" w:type="dxa"/>
+            </w:tcMar>
+            <w:vAlign w:val="center"/>
+            <w:hideMark/>
+          </w:tcPr>
+          <w:p>
+            <w:pPr>
+              <w:rPr>
+                <w:b/>
+                <w:bCs/>
+              </w:rPr>
+            </w:pPr>
+            <w:hyperlink r:id="rId7" w:tgtFrame="_blank" w:history="1">
+              <w:r>
+                <w:rPr>
+                  <w:rStyle w:val="Hyperlink"/>
+                  <w:b/>
+                  <w:bCs/>
+                </w:rPr>
+                <w:t>src/module_4c/fundamentals_db.py</w:t>
+              </w:r>
+            </w:hyperlink>
+          </w:p>
+        </w:tc>
+        <w:tc>
+          <w:tcPr>
+            <w:tcW w:w="0" w:type="auto"/>
+            <w:tcBorders>
+              <w:top w:val="single" w:sz="2" w:space="0" w:color="2A2B2C"/>
+              <w:left w:val="single" w:sz="2" w:space="0" w:color="2A2B2C"/>
+              <w:bottom w:val="single" w:sz="2" w:space="0" w:color="2A2B2C"/>
+              <w:right w:val="single" w:sz="2" w:space="0" w:color="2A2B2C"/>
+            </w:tcBorders>
+            <w:shd w:val="clear" w:color="auto" w:fill="191A1B"/>
+            <w:tcMar>
+              <w:top w:w="30" w:type="dxa"/>
+              <w:left w:w="30" w:type="dxa"/>
+              <w:bottom w:w="30" w:type="dxa"/>
+              <w:right w:w="30" w:type="dxa"/>
+            </w:tcMar>
+            <w:vAlign w:val="center"/>
+            <w:hideMark/>
+          </w:tcPr>
+          <w:p>
+            <w:pPr>
+              <w:rPr>
+                <w:b/>
+                <w:bCs/>
+              </w:rPr>
+            </w:pPr>
+            <w:r>
+              <w:rPr>
+                <w:b/>
+                <w:bCs/>
+              </w:rPr>
+              <w:t xml:space="preserve">SQLite schema (4 tables) + WAL mode + additive migrations + </w:t>
+            </w:r>
+            <w:proofErr w:type="spellStart"/>
+            <w:r>
+              <w:rPr>
+                <w:b/>
+                <w:bCs/>
+              </w:rPr>
+              <w:t>upsert</w:t>
+            </w:r>
+            <w:proofErr w:type="spellEnd"/>
+            <w:r>
+              <w:rPr>
+                <w:b/>
+                <w:bCs/>
+              </w:rPr>
+              <w:t xml:space="preserve"> helpers</w:t>
+            </w:r>
+          </w:p>
+        </w:tc>
+      </w:tr>
+      <w:tr>
+        <w:tc>
+          <w:tcPr>
+            <w:tcW w:w="0" w:type="auto"/>
+            <w:tcBorders>
+              <w:top w:val="single" w:sz="2" w:space="0" w:color="2A2B2C"/>
+              <w:left w:val="single" w:sz="2" w:space="0" w:color="2A2B2C"/>
+              <w:bottom w:val="single" w:sz="2" w:space="0" w:color="2A2B2C"/>
+              <w:right w:val="single" w:sz="2" w:space="0" w:color="2A2B2C"/>
+            </w:tcBorders>
+            <w:shd w:val="clear" w:color="auto" w:fill="191A1B"/>
+            <w:tcMar>
+              <w:top w:w="30" w:type="dxa"/>
+              <w:left w:w="30" w:type="dxa"/>
+              <w:bottom w:w="30" w:type="dxa"/>
+              <w:right w:w="30" w:type="dxa"/>
+            </w:tcMar>
+            <w:vAlign w:val="center"/>
+            <w:hideMark/>
+          </w:tcPr>
+          <w:p>
+            <w:pPr>
+              <w:rPr>
+                <w:b/>
+                <w:bCs/>
+              </w:rPr>
+            </w:pPr>
+            <w:hyperlink r:id="rId8" w:tgtFrame="_blank" w:history="1">
+              <w:r>
+                <w:rPr>
+                  <w:rStyle w:val="Hyperlink"/>
+                  <w:b/>
+                  <w:bCs/>
+                </w:rPr>
+                <w:t>src/module_4c/industries.py</w:t>
+              </w:r>
+            </w:hyperlink>
+          </w:p>
+        </w:tc>
+        <w:tc>
+          <w:tcPr>
+            <w:tcW w:w="0" w:type="auto"/>
+            <w:tcBorders>
+              <w:top w:val="single" w:sz="2" w:space="0" w:color="2A2B2C"/>
+              <w:left w:val="single" w:sz="2" w:space="0" w:color="2A2B2C"/>
+              <w:bottom w:val="single" w:sz="2" w:space="0" w:color="2A2B2C"/>
+              <w:right w:val="single" w:sz="2" w:space="0" w:color="2A2B2C"/>
+            </w:tcBorders>
+            <w:shd w:val="clear" w:color="auto" w:fill="191A1B"/>
+            <w:tcMar>
+              <w:top w:w="30" w:type="dxa"/>
+              <w:left w:w="30" w:type="dxa"/>
+              <w:bottom w:w="30" w:type="dxa"/>
+              <w:right w:w="30" w:type="dxa"/>
+            </w:tcMar>
+            <w:vAlign w:val="center"/>
+            <w:hideMark/>
+          </w:tcPr>
+          <w:p>
+            <w:pPr>
+              <w:rPr>
+                <w:b/>
+                <w:bCs/>
+              </w:rPr>
+            </w:pPr>
+            <w:r>
+              <w:rPr>
+                <w:b/>
+                <w:bCs/>
+              </w:rPr>
+              <w:t>Biotech allow-list gate (reads </w:t>
+            </w:r>
+            <w:proofErr w:type="spellStart"/>
+            <w:r>
+              <w:rPr>
+                <w:b/>
+                <w:bCs/>
+              </w:rPr>
+              <w:t>prices.db.ticker_snapshot.industry</w:t>
+            </w:r>
+            <w:proofErr w:type="spellEnd"/>
+            <w:r>
+              <w:rPr>
+                <w:b/>
+                <w:bCs/>
+              </w:rPr>
+              <w:t>)</w:t>
+            </w:r>
+          </w:p>
+        </w:tc>
+      </w:tr>
+      <w:tr>
+        <w:tc>
+          <w:tcPr>
+            <w:tcW w:w="0" w:type="auto"/>
+            <w:tcBorders>
+              <w:top w:val="single" w:sz="2" w:space="0" w:color="2A2B2C"/>
+              <w:left w:val="single" w:sz="2" w:space="0" w:color="2A2B2C"/>
+              <w:bottom w:val="single" w:sz="2" w:space="0" w:color="2A2B2C"/>
+              <w:right w:val="single" w:sz="2" w:space="0" w:color="2A2B2C"/>
+            </w:tcBorders>
+            <w:shd w:val="clear" w:color="auto" w:fill="191A1B"/>
+            <w:tcMar>
+              <w:top w:w="30" w:type="dxa"/>
+              <w:left w:w="30" w:type="dxa"/>
+              <w:bottom w:w="30" w:type="dxa"/>
+              <w:right w:w="30" w:type="dxa"/>
+            </w:tcMar>
+            <w:vAlign w:val="center"/>
+            <w:hideMark/>
+          </w:tcPr>
+          <w:p>
+            <w:pPr>
+              <w:rPr>
+                <w:b/>
+                <w:bCs/>
+              </w:rPr>
+            </w:pPr>
+            <w:hyperlink r:id="rId9" w:tgtFrame="_blank" w:history="1">
+              <w:r>
+                <w:rPr>
+                  <w:rStyle w:val="Hyperlink"/>
+                  <w:b/>
+                  <w:bCs/>
+                </w:rPr>
+                <w:t>config/</w:t>
+              </w:r>
+              <w:proofErr w:type="spellStart"/>
+              <w:r>
+                <w:rPr>
+                  <w:rStyle w:val="Hyperlink"/>
+                  <w:b/>
+                  <w:bCs/>
+                </w:rPr>
+                <w:t>fundamentals.yaml</w:t>
+              </w:r>
+              <w:proofErr w:type="spellEnd"/>
+            </w:hyperlink>
+          </w:p>
+        </w:tc>
+        <w:tc>
+          <w:tcPr>
+            <w:tcW w:w="0" w:type="auto"/>
+            <w:tcBorders>
+              <w:top w:val="single" w:sz="2" w:space="0" w:color="2A2B2C"/>
+              <w:left w:val="single" w:sz="2" w:space="0" w:color="2A2B2C"/>
+              <w:bottom w:val="single" w:sz="2" w:space="0" w:color="2A2B2C"/>
+              <w:right w:val="single" w:sz="2" w:space="0" w:color="2A2B2C"/>
+            </w:tcBorders>
+            <w:shd w:val="clear" w:color="auto" w:fill="191A1B"/>
+            <w:tcMar>
+              <w:top w:w="30" w:type="dxa"/>
+              <w:left w:w="30" w:type="dxa"/>
+              <w:bottom w:w="30" w:type="dxa"/>
+              <w:right w:w="30" w:type="dxa"/>
+            </w:tcMar>
+            <w:vAlign w:val="center"/>
+            <w:hideMark/>
+          </w:tcPr>
+          <w:p>
+            <w:pPr>
+              <w:rPr>
+                <w:b/>
+                <w:bCs/>
+              </w:rPr>
+            </w:pPr>
+            <w:r>
+              <w:rPr>
+                <w:b/>
+                <w:bCs/>
+              </w:rPr>
+              <w:t xml:space="preserve">TTLs, biotech industry list, source toggles, </w:t>
+            </w:r>
+            <w:proofErr w:type="spellStart"/>
+            <w:r>
+              <w:rPr>
+                <w:b/>
+                <w:bCs/>
+              </w:rPr>
+              <w:t>max_workers</w:t>
+            </w:r>
+            <w:proofErr w:type="spellEnd"/>
+          </w:p>
+        </w:tc>
+      </w:tr>
+      <w:tr>
+        <w:tc>
+          <w:tcPr>
+            <w:tcW w:w="0" w:type="auto"/>
+            <w:tcBorders>
+              <w:top w:val="single" w:sz="2" w:space="0" w:color="2A2B2C"/>
+              <w:left w:val="single" w:sz="2" w:space="0" w:color="2A2B2C"/>
+              <w:bottom w:val="single" w:sz="2" w:space="0" w:color="2A2B2C"/>
+              <w:right w:val="single" w:sz="2" w:space="0" w:color="2A2B2C"/>
+            </w:tcBorders>
+            <w:shd w:val="clear" w:color="auto" w:fill="191A1B"/>
+            <w:tcMar>
+              <w:top w:w="30" w:type="dxa"/>
+              <w:left w:w="30" w:type="dxa"/>
+              <w:bottom w:w="30" w:type="dxa"/>
+              <w:right w:w="30" w:type="dxa"/>
+            </w:tcMar>
+            <w:vAlign w:val="center"/>
+            <w:hideMark/>
+          </w:tcPr>
+          <w:p>
+            <w:pPr>
+              <w:rPr>
+                <w:b/>
+                <w:bCs/>
+              </w:rPr>
+            </w:pPr>
+            <w:hyperlink r:id="rId10" w:tgtFrame="_blank" w:history="1">
+              <w:r>
+                <w:rPr>
+                  <w:rStyle w:val="Hyperlink"/>
+                  <w:b/>
+                  <w:bCs/>
+                </w:rPr>
+                <w:t>scripts/4c_enrich_fundamentals.py</w:t>
+              </w:r>
+            </w:hyperlink>
+          </w:p>
+        </w:tc>
+        <w:tc>
+          <w:tcPr>
+            <w:tcW w:w="0" w:type="auto"/>
+            <w:tcBorders>
+              <w:top w:val="single" w:sz="2" w:space="0" w:color="2A2B2C"/>
+              <w:left w:val="single" w:sz="2" w:space="0" w:color="2A2B2C"/>
+              <w:bottom w:val="single" w:sz="2" w:space="0" w:color="2A2B2C"/>
+              <w:right w:val="single" w:sz="2" w:space="0" w:color="2A2B2C"/>
+            </w:tcBorders>
+            <w:shd w:val="clear" w:color="auto" w:fill="191A1B"/>
+            <w:tcMar>
+              <w:top w:w="30" w:type="dxa"/>
+              <w:left w:w="30" w:type="dxa"/>
+              <w:bottom w:w="30" w:type="dxa"/>
+              <w:right w:w="30" w:type="dxa"/>
+            </w:tcMar>
+            <w:vAlign w:val="center"/>
+            <w:hideMark/>
+          </w:tcPr>
+          <w:p>
+            <w:pPr>
+              <w:rPr>
+                <w:b/>
+                <w:bCs/>
+              </w:rPr>
+            </w:pPr>
+            <w:r>
+              <w:rPr>
+                <w:b/>
+                <w:bCs/>
+              </w:rPr>
+              <w:t>CLI: --ticker, --tickers, --source, --force-refresh, --dry-run, -v</w:t>
+            </w:r>
+          </w:p>
+        </w:tc>
+      </w:tr>
+      <w:tr>
+        <w:tc>
+          <w:tcPr>
+            <w:tcW w:w="0" w:type="auto"/>
+            <w:tcBorders>
+              <w:top w:val="single" w:sz="2" w:space="0" w:color="2A2B2C"/>
+              <w:left w:val="single" w:sz="2" w:space="0" w:color="2A2B2C"/>
+              <w:bottom w:val="single" w:sz="2" w:space="0" w:color="2A2B2C"/>
+              <w:right w:val="single" w:sz="2" w:space="0" w:color="2A2B2C"/>
+            </w:tcBorders>
+            <w:shd w:val="clear" w:color="auto" w:fill="191A1B"/>
+            <w:tcMar>
+              <w:top w:w="30" w:type="dxa"/>
+              <w:left w:w="30" w:type="dxa"/>
+              <w:bottom w:w="30" w:type="dxa"/>
+              <w:right w:w="30" w:type="dxa"/>
+            </w:tcMar>
+            <w:vAlign w:val="center"/>
+            <w:hideMark/>
+          </w:tcPr>
+          <w:p>
+            <w:pPr>
+              <w:rPr>
+                <w:b/>
+                <w:bCs/>
+              </w:rPr>
+            </w:pPr>
+            <w:hyperlink r:id="rId11" w:tgtFrame="_blank" w:history="1">
+              <w:r>
+                <w:rPr>
+                  <w:rStyle w:val="Hyperlink"/>
+                  <w:b/>
+                  <w:bCs/>
+                </w:rPr>
+                <w:t>src/module_5/fundamentals.py</w:t>
+              </w:r>
+            </w:hyperlink>
+          </w:p>
+        </w:tc>
+        <w:tc>
+          <w:tcPr>
+            <w:tcW w:w="0" w:type="auto"/>
+            <w:tcBorders>
+              <w:top w:val="single" w:sz="2" w:space="0" w:color="2A2B2C"/>
+              <w:left w:val="single" w:sz="2" w:space="0" w:color="2A2B2C"/>
+              <w:bottom w:val="single" w:sz="2" w:space="0" w:color="2A2B2C"/>
+              <w:right w:val="single" w:sz="2" w:space="0" w:color="2A2B2C"/>
+            </w:tcBorders>
+            <w:shd w:val="clear" w:color="auto" w:fill="191A1B"/>
+            <w:tcMar>
+              <w:top w:w="30" w:type="dxa"/>
+              <w:left w:w="30" w:type="dxa"/>
+              <w:bottom w:w="30" w:type="dxa"/>
+              <w:right w:w="30" w:type="dxa"/>
+            </w:tcMar>
+            <w:vAlign w:val="center"/>
+            <w:hideMark/>
+          </w:tcPr>
+          <w:p>
+            <w:pPr>
+              <w:rPr>
+                <w:b/>
+                <w:bCs/>
+              </w:rPr>
+            </w:pPr>
+            <w:r>
+              <w:rPr>
+                <w:b/>
+                <w:bCs/>
+              </w:rPr>
+              <w:t>M5-side reader — bulk-loads the latest financials/raises/insiders per ticker and shapes them into the </w:t>
+            </w:r>
+            <w:proofErr w:type="spellStart"/>
+            <w:r>
+              <w:rPr>
+                <w:b/>
+                <w:bCs/>
+              </w:rPr>
+              <w:t>pack.fundamentals</w:t>
+            </w:r>
+            <w:proofErr w:type="spellEnd"/>
+            <w:r>
+              <w:rPr>
+                <w:b/>
+                <w:bCs/>
+              </w:rPr>
+              <w:t> block</w:t>
             </w:r>
           </w:p>
         </w:tc>
       </w:tr>
     </w:tbl>
     <w:p>
-      <w:r>
-        <w:t xml:space="preserve">After fetching capital raises, M4c computes </w:t>
-      </w:r>
-      <w:proofErr w:type="spellStart"/>
-      <w:r>
-        <w:t>shelf_registration_usd_capacity</w:t>
-      </w:r>
-      <w:proofErr w:type="spellEnd"/>
-      <w:r>
-        <w:t xml:space="preserve"> = MAX(S-3 </w:t>
-      </w:r>
-      <w:proofErr w:type="spellStart"/>
-      <w:r>
-        <w:t>gross_proceeds</w:t>
-      </w:r>
-      <w:proofErr w:type="spellEnd"/>
-      <w:r>
-        <w:t xml:space="preserve">) - SUM(424B5 </w:t>
-      </w:r>
-      <w:proofErr w:type="spellStart"/>
-      <w:r>
-        <w:t>gross_proceeds</w:t>
-      </w:r>
-      <w:proofErr w:type="spellEnd"/>
-      <w:r>
-        <w:t>) over the trailing 3y window and writes it to the latest financials row.</w:t>
+      <w:pPr>
+        <w:rPr>
+          <w:b/>
+          <w:bCs/>
+        </w:rPr>
+      </w:pPr>
+      <w:r>
+        <w:rPr>
+          <w:b/>
+          <w:bCs/>
+        </w:rPr>
+        <w:t>Known v1 limitations</w:t>
       </w:r>
     </w:p>
     <w:p>
       <w:pPr>
-        <w:rPr>
-          <w:b/>
-          <w:bCs/>
-        </w:rPr>
-      </w:pPr>
-      <w:r>
-        <w:rPr>
-          <w:b/>
-          <w:bCs/>
-        </w:rPr>
-        <w:t>What M5 does with it</w:t>
+        <w:numPr>
+          <w:ilvl w:val="0"/>
+          <w:numId w:val="22"/>
+        </w:numPr>
+        <w:rPr>
+          <w:b/>
+          <w:bCs/>
+        </w:rPr>
+      </w:pPr>
+      <w:proofErr w:type="spellStart"/>
+      <w:r>
+        <w:rPr>
+          <w:b/>
+          <w:bCs/>
+        </w:rPr>
+        <w:t>prefunded_warrants_count</w:t>
+      </w:r>
+      <w:proofErr w:type="spellEnd"/>
+      <w:r>
+        <w:rPr>
+          <w:b/>
+          <w:bCs/>
+        </w:rPr>
+        <w:t xml:space="preserve"> always NULL — XBRL has no PFW concept. M6 still </w:t>
+      </w:r>
+      <w:proofErr w:type="spellStart"/>
+      <w:r>
+        <w:rPr>
+          <w:b/>
+          <w:bCs/>
+        </w:rPr>
+        <w:t>web_searches</w:t>
+      </w:r>
+      <w:proofErr w:type="spellEnd"/>
+      <w:r>
+        <w:rPr>
+          <w:b/>
+          <w:bCs/>
+        </w:rPr>
+        <w:t xml:space="preserve"> when the prompt asks. (Polish item: 10-Q footnote text-mining heuristic.)</w:t>
       </w:r>
     </w:p>
     <w:p>
-      <w:hyperlink r:id="rId5" w:tgtFrame="_blank" w:history="1">
-        <w:r>
-          <w:rPr>
-            <w:rStyle w:val="Hyperlink"/>
-          </w:rPr>
-          <w:t>src/module_5/fundamentals.py</w:t>
-        </w:r>
-      </w:hyperlink>
-      <w:r>
-        <w:t xml:space="preserve"> reads data/</w:t>
+      <w:pPr>
+        <w:numPr>
+          <w:ilvl w:val="0"/>
+          <w:numId w:val="22"/>
+        </w:numPr>
+        <w:rPr>
+          <w:b/>
+          <w:bCs/>
+        </w:rPr>
+      </w:pPr>
+      <w:r>
+        <w:rPr>
+          <w:b/>
+          <w:bCs/>
+        </w:rPr>
+        <w:t>8-K body parser regex hit rate ~0% for </w:t>
       </w:r>
       <w:proofErr w:type="spellStart"/>
       <w:r>
-        <w:t>fundamentals.db</w:t>
+        <w:rPr>
+          <w:b/>
+          <w:bCs/>
+        </w:rPr>
+        <w:t>gross_proceeds_usd</w:t>
       </w:r>
       <w:proofErr w:type="spellEnd"/>
       <w:r>
-        <w:t xml:space="preserve"> once per M5 run and produces a per-ticker </w:t>
+        <w:rPr>
+          <w:b/>
+          <w:bCs/>
+        </w:rPr>
+        <w:t> — Item 3.02 / 1.01 prose varies wildly. Audit rows + </w:t>
       </w:r>
       <w:proofErr w:type="spellStart"/>
       <w:r>
-        <w:t>dict</w:t>
+        <w:rPr>
+          <w:b/>
+          <w:bCs/>
+        </w:rPr>
+        <w:t>raw_filing_url</w:t>
       </w:r>
       <w:proofErr w:type="spellEnd"/>
       <w:r>
-        <w:t>:</w:t>
+        <w:rPr>
+          <w:b/>
+          <w:bCs/>
+        </w:rPr>
+        <w:t> preserved for human triage. (Polish item: regex v2 against a sample of real filings.)</w:t>
       </w:r>
     </w:p>
     <w:p>
-      <w:r>
-        <w:t>{</w:t>
+      <w:pPr>
+        <w:numPr>
+          <w:ilvl w:val="0"/>
+          <w:numId w:val="22"/>
+        </w:numPr>
+        <w:rPr>
+          <w:b/>
+          <w:bCs/>
+        </w:rPr>
+      </w:pPr>
+      <w:r>
+        <w:rPr>
+          <w:b/>
+          <w:bCs/>
+        </w:rPr>
+        <w:t xml:space="preserve">20-F filers (e.g. LEGN, a Cayman PLC) → 0 rows from </w:t>
+      </w:r>
+      <w:proofErr w:type="spellStart"/>
+      <w:r>
+        <w:rPr>
+          <w:b/>
+          <w:bCs/>
+        </w:rPr>
+        <w:t>companyfacts</w:t>
+      </w:r>
+      <w:proofErr w:type="spellEnd"/>
+      <w:r>
+        <w:rPr>
+          <w:b/>
+          <w:bCs/>
+        </w:rPr>
+        <w:t xml:space="preserve"> — the XBRL payload exists but its periods don't match the 10-Q/10-K cadence. M6 falls back to </w:t>
+      </w:r>
+      <w:proofErr w:type="spellStart"/>
+      <w:r>
+        <w:rPr>
+          <w:b/>
+          <w:bCs/>
+        </w:rPr>
+        <w:t>web_search</w:t>
+      </w:r>
+      <w:proofErr w:type="spellEnd"/>
+      <w:r>
+        <w:rPr>
+          <w:b/>
+          <w:bCs/>
+        </w:rPr>
+        <w:t xml:space="preserve"> for those tickers. Documented as expected </w:t>
+      </w:r>
+      <w:proofErr w:type="spellStart"/>
+      <w:r>
+        <w:rPr>
+          <w:b/>
+          <w:bCs/>
+        </w:rPr>
+        <w:t>behavior</w:t>
+      </w:r>
+      <w:proofErr w:type="spellEnd"/>
+      <w:r>
+        <w:rPr>
+          <w:b/>
+          <w:bCs/>
+        </w:rPr>
+        <w:t>.</w:t>
       </w:r>
     </w:p>
     <w:p>
-      <w:r>
-        <w:t xml:space="preserve">  "available": true,</w:t>
+      <w:pPr>
+        <w:rPr>
+          <w:b/>
+          <w:bCs/>
+        </w:rPr>
+      </w:pPr>
+      <w:r>
+        <w:rPr>
+          <w:b/>
+          <w:bCs/>
+        </w:rPr>
+        <w:t xml:space="preserve">Today's actual data (after yesterday's full backfill of 214 </w:t>
+      </w:r>
+      <w:proofErr w:type="spellStart"/>
+      <w:r>
+        <w:rPr>
+          <w:b/>
+          <w:bCs/>
+        </w:rPr>
+        <w:t>biotechs</w:t>
+      </w:r>
+      <w:proofErr w:type="spellEnd"/>
+      <w:r>
+        <w:rPr>
+          <w:b/>
+          <w:bCs/>
+        </w:rPr>
+        <w:t>)</w:t>
       </w:r>
     </w:p>
     <w:p>
-      <w:r>
-        <w:t xml:space="preserve">  "</w:t>
-      </w:r>
-      <w:proofErr w:type="spellStart"/>
-      <w:r>
-        <w:t>as_of</w:t>
-      </w:r>
-      <w:proofErr w:type="spellEnd"/>
-      <w:r>
-        <w:t>": "2025-12-31",</w:t>
+      <w:pPr>
+        <w:rPr>
+          <w:b/>
+          <w:bCs/>
+        </w:rPr>
+      </w:pPr>
+      <w:r>
+        <w:rPr>
+          <w:b/>
+          <w:bCs/>
+        </w:rPr>
+        <w:t>financials:           51 rows  (mostly the historical run; today's cold-start added ~2,210 more across 214 tickers)</w:t>
       </w:r>
     </w:p>
     <w:p>
-      <w:r>
-        <w:t xml:space="preserve">  "</w:t>
-      </w:r>
+      <w:pPr>
+        <w:rPr>
+          <w:b/>
+          <w:bCs/>
+        </w:rPr>
+      </w:pPr>
       <w:proofErr w:type="spellStart"/>
       <w:r>
-        <w:t>fundamentals_fetched_at</w:t>
+        <w:rPr>
+          <w:b/>
+          <w:bCs/>
+        </w:rPr>
+        <w:t>capital_raises</w:t>
       </w:r>
       <w:proofErr w:type="spellEnd"/>
       <w:r>
-        <w:t>": "2026-04-26T14:54:55Z",</w:t>
+        <w:rPr>
+          <w:b/>
+          <w:bCs/>
+        </w:rPr>
+        <w:t>:       7,668 rows</w:t>
       </w:r>
     </w:p>
     <w:p>
-      <w:r>
-        <w:t xml:space="preserve">  "financials": {</w:t>
+      <w:pPr>
+        <w:rPr>
+          <w:b/>
+          <w:bCs/>
+        </w:rPr>
+      </w:pPr>
+      <w:proofErr w:type="spellStart"/>
+      <w:r>
+        <w:rPr>
+          <w:b/>
+          <w:bCs/>
+        </w:rPr>
+        <w:t>insider_transactions</w:t>
+      </w:r>
+      <w:proofErr w:type="spellEnd"/>
+      <w:r>
+        <w:rPr>
+          <w:b/>
+          <w:bCs/>
+        </w:rPr>
+        <w:t>: 34,190 rows</w:t>
       </w:r>
     </w:p>
     <w:p>
-      <w:r>
-        <w:t xml:space="preserve">    "</w:t>
-      </w:r>
+      <w:pPr>
+        <w:rPr>
+          <w:b/>
+          <w:bCs/>
+        </w:rPr>
+      </w:pPr>
       <w:proofErr w:type="spellStart"/>
       <w:r>
-        <w:t>cash_total_usd</w:t>
+        <w:rPr>
+          <w:b/>
+          <w:bCs/>
+        </w:rPr>
+        <w:t>fetch_log</w:t>
       </w:r>
       <w:proofErr w:type="spellEnd"/>
       <w:r>
-        <w:t>": 449884000,</w:t>
+        <w:rPr>
+          <w:b/>
+          <w:bCs/>
+        </w:rPr>
+        <w:t>:            ~860 rows  (215 tickers × 4 sources)</w:t>
       </w:r>
     </w:p>
     <w:p>
-      <w:r>
-        <w:t xml:space="preserve">    "</w:t>
+      <w:pPr>
+        <w:rPr>
+          <w:b/>
+          <w:bCs/>
+        </w:rPr>
+      </w:pPr>
+      <w:r>
+        <w:rPr>
+          <w:b/>
+          <w:bCs/>
+        </w:rPr>
+        <w:t xml:space="preserve">So in plain English: M4c is the pipeline's "go to SEC, grab everything that's a number, and put it in a database so the expensive LLM doesn't have to look it up" step. It runs free, idempotently, and only on </w:t>
       </w:r>
       <w:proofErr w:type="spellStart"/>
       <w:r>
-        <w:t>runway_months</w:t>
+        <w:rPr>
+          <w:b/>
+          <w:bCs/>
+        </w:rPr>
+        <w:t>biotechs</w:t>
       </w:r>
       <w:proofErr w:type="spellEnd"/>
       <w:r>
-        <w:t>": 13.7,</w:t>
-      </w:r>
-    </w:p>
-    <w:p>
-      <w:r>
-        <w:t xml:space="preserve">    "</w:t>
-      </w:r>
-      <w:proofErr w:type="spellStart"/>
-      <w:r>
-        <w:t>quarterly_burn_usd</w:t>
-      </w:r>
-      <w:proofErr w:type="spellEnd"/>
-      <w:r>
-        <w:t>": 98684000,</w:t>
-      </w:r>
-    </w:p>
-    <w:p>
-      <w:r>
-        <w:t xml:space="preserve">    "</w:t>
-      </w:r>
-      <w:proofErr w:type="spellStart"/>
-      <w:r>
-        <w:t>basic_shares_count</w:t>
-      </w:r>
-      <w:proofErr w:type="spellEnd"/>
-      <w:r>
-        <w:t>": 116317060,</w:t>
-      </w:r>
-    </w:p>
-    <w:p>
-      <w:r>
-        <w:t xml:space="preserve">    "</w:t>
-      </w:r>
-      <w:proofErr w:type="spellStart"/>
-      <w:r>
-        <w:t>shelf_registration_usd_capacity</w:t>
-      </w:r>
-      <w:proofErr w:type="spellEnd"/>
-      <w:r>
-        <w:t>": null,</w:t>
-      </w:r>
-    </w:p>
-    <w:p>
-      <w:r>
-        <w:t xml:space="preserve">    ...</w:t>
-      </w:r>
-    </w:p>
-    <w:p>
-      <w:r>
-        <w:t xml:space="preserve">  },</w:t>
-      </w:r>
-    </w:p>
-    <w:p>
-      <w:r>
-        <w:t xml:space="preserve">  "</w:t>
-      </w:r>
-      <w:proofErr w:type="spellStart"/>
-      <w:r>
-        <w:t>recent_capital_raises</w:t>
-      </w:r>
-      <w:proofErr w:type="spellEnd"/>
-      <w:r>
-        <w:t>": [...last 365d...],</w:t>
-      </w:r>
-    </w:p>
-    <w:p>
-      <w:r>
-        <w:t xml:space="preserve">  "</w:t>
-      </w:r>
-      <w:proofErr w:type="spellStart"/>
-      <w:r>
-        <w:t>recent_insider_transactions</w:t>
-      </w:r>
-      <w:proofErr w:type="spellEnd"/>
-      <w:r>
-        <w:t>": [...last 365d...],</w:t>
-      </w:r>
-    </w:p>
-    <w:p>
-      <w:r>
-        <w:t xml:space="preserve">  "</w:t>
-      </w:r>
-      <w:proofErr w:type="spellStart"/>
-      <w:r>
-        <w:t>data_status</w:t>
-      </w:r>
-      <w:proofErr w:type="spellEnd"/>
-      <w:r>
-        <w:t>": {</w:t>
-      </w:r>
-    </w:p>
-    <w:p>
-      <w:r>
-        <w:t xml:space="preserve">    "</w:t>
-      </w:r>
-      <w:proofErr w:type="spellStart"/>
-      <w:r>
-        <w:t>companyfacts</w:t>
-      </w:r>
-      <w:proofErr w:type="spellEnd"/>
-      <w:r>
-        <w:t>": {"</w:t>
-      </w:r>
-      <w:proofErr w:type="spellStart"/>
-      <w:r>
-        <w:t>fetched_at</w:t>
-      </w:r>
-      <w:proofErr w:type="spellEnd"/>
-      <w:r>
-        <w:t>": "...", "status": "ok"},</w:t>
-      </w:r>
-    </w:p>
-    <w:p>
-      <w:r>
-        <w:t xml:space="preserve">    ...</w:t>
-      </w:r>
-    </w:p>
-    <w:p>
-      <w:r>
-        <w:t xml:space="preserve">  }</w:t>
-      </w:r>
-    </w:p>
-    <w:p>
-      <w:r>
-        <w:t>}</w:t>
-      </w:r>
-    </w:p>
-    <w:p>
-      <w:r>
-        <w:t xml:space="preserve">That </w:t>
-      </w:r>
-      <w:proofErr w:type="spellStart"/>
-      <w:r>
-        <w:t>dict</w:t>
-      </w:r>
-      <w:proofErr w:type="spellEnd"/>
-      <w:r>
-        <w:t xml:space="preserve"> becomes the top-level </w:t>
-      </w:r>
-      <w:proofErr w:type="spellStart"/>
-      <w:r>
-        <w:t>pack.fundamentals</w:t>
-      </w:r>
-      <w:proofErr w:type="spellEnd"/>
-      <w:r>
-        <w:t xml:space="preserve"> key. The pack's _HASH_FIELDS includes </w:t>
-      </w:r>
-      <w:proofErr w:type="spellStart"/>
-      <w:r>
-        <w:t>fundamentals_fetched_at</w:t>
-      </w:r>
-      <w:proofErr w:type="spellEnd"/>
-      <w:r>
-        <w:t>, so when M4c refreshes a ticker, the M5 cache for THAT ticker invalidates — but other 1418 tickers stay cached.</w:t>
-      </w:r>
-    </w:p>
-    <w:p>
-      <w:pPr>
-        <w:rPr>
-          <w:b/>
-          <w:bCs/>
-        </w:rPr>
-      </w:pPr>
-      <w:r>
-        <w:rPr>
-          <w:b/>
-          <w:bCs/>
-        </w:rPr>
-        <w:t>Concrete example — what NTLA looks like end-to-end</w:t>
-      </w:r>
-    </w:p>
-    <w:p>
-      <w:r>
-        <w:t>After running python scripts/4c_enrich_fundamentals.py --ticker NTLA -v once:</w:t>
-      </w:r>
-    </w:p>
-    <w:p>
-      <w:pPr>
-        <w:numPr>
-          <w:ilvl w:val="0"/>
-          <w:numId w:val="16"/>
-        </w:numPr>
-      </w:pPr>
-      <w:r>
-        <w:lastRenderedPageBreak/>
-        <w:t>8 quarterly financials rows (latest = 2025-FY 10-K)</w:t>
-      </w:r>
-    </w:p>
-    <w:p>
-      <w:pPr>
-        <w:numPr>
-          <w:ilvl w:val="0"/>
-          <w:numId w:val="16"/>
-        </w:numPr>
-      </w:pPr>
-      <w:r>
-        <w:t>Latest row: cash $449.9M, quarterly burn $98.7M → </w:t>
-      </w:r>
-      <w:r>
-        <w:rPr>
-          <w:b/>
-          <w:bCs/>
-        </w:rPr>
-        <w:t>runway 13.7 months</w:t>
-      </w:r>
-      <w:r>
-        <w:t>, basic shares 116.3M</w:t>
-      </w:r>
-    </w:p>
-    <w:p>
-      <w:pPr>
-        <w:numPr>
-          <w:ilvl w:val="0"/>
-          <w:numId w:val="16"/>
-        </w:numPr>
-      </w:pPr>
-      <w:r>
-        <w:t>158 </w:t>
-      </w:r>
-      <w:proofErr w:type="spellStart"/>
-      <w:r>
-        <w:t>insider_transactions</w:t>
-      </w:r>
-      <w:proofErr w:type="spellEnd"/>
-      <w:r>
-        <w:t xml:space="preserve"> rows (85 </w:t>
-      </w:r>
-      <w:proofErr w:type="spellStart"/>
-      <w:r>
-        <w:t>option_grant</w:t>
-      </w:r>
-      <w:proofErr w:type="spellEnd"/>
-      <w:r>
-        <w:t xml:space="preserve">, 51 sell, 10 </w:t>
-      </w:r>
-      <w:proofErr w:type="spellStart"/>
-      <w:r>
-        <w:t>option_exercise</w:t>
-      </w:r>
-      <w:proofErr w:type="spellEnd"/>
-      <w:r>
-        <w:t>, </w:t>
-      </w:r>
-      <w:r>
-        <w:rPr>
-          <w:b/>
-          <w:bCs/>
-        </w:rPr>
-        <w:t>2 buys</w:t>
-      </w:r>
-      <w:r>
-        <w:t>)</w:t>
-      </w:r>
-    </w:p>
-    <w:p>
-      <w:pPr>
-        <w:numPr>
-          <w:ilvl w:val="0"/>
-          <w:numId w:val="16"/>
-        </w:numPr>
-      </w:pPr>
-      <w:r>
-        <w:t>47 </w:t>
-      </w:r>
-      <w:proofErr w:type="spellStart"/>
-      <w:r>
-        <w:t>capital_raises</w:t>
-      </w:r>
-      <w:proofErr w:type="spellEnd"/>
-      <w:r>
-        <w:t xml:space="preserve"> audit rows (3 × 424B5 + 44 × 8-K) — </w:t>
-      </w:r>
-      <w:proofErr w:type="spellStart"/>
-      <w:r>
-        <w:t>gross_proceeds</w:t>
-      </w:r>
-      <w:proofErr w:type="spellEnd"/>
-      <w:r>
-        <w:t xml:space="preserve"> null for most (regex limitations)</w:t>
-      </w:r>
-    </w:p>
-    <w:p>
-      <w:r>
-        <w:t>After re-running M5, NTLA's pack gains the fundamentals block carrying that data. M6 doesn't read it yet (m6-v3 stays unchanged this session); the data sits ready for a future m6-v4 prompt revision.</w:t>
-      </w:r>
-    </w:p>
-    <w:p>
-      <w:pPr>
-        <w:rPr>
-          <w:b/>
-          <w:bCs/>
-        </w:rPr>
-      </w:pPr>
-      <w:r>
-        <w:rPr>
-          <w:b/>
-          <w:bCs/>
-        </w:rPr>
-        <w:t>What M4c deliberately does NOT do</w:t>
-      </w:r>
-    </w:p>
-    <w:p>
-      <w:pPr>
-        <w:numPr>
-          <w:ilvl w:val="0"/>
-          <w:numId w:val="17"/>
-        </w:numPr>
-      </w:pPr>
-      <w:r>
-        <w:rPr>
-          <w:b/>
-          <w:bCs/>
-        </w:rPr>
-        <w:t>No ClinicalTrials.gov calls.</w:t>
-      </w:r>
-      <w:r>
-        <w:t> No </w:t>
-      </w:r>
-      <w:proofErr w:type="spellStart"/>
-      <w:r>
-        <w:t>clinical_trials</w:t>
-      </w:r>
-      <w:proofErr w:type="spellEnd"/>
-      <w:r>
-        <w:t> table. Per your direction, clinical synthesis (interim/final readouts, past failures, ongoing trials) stays with M6's </w:t>
-      </w:r>
-      <w:proofErr w:type="spellStart"/>
-      <w:r>
-        <w:t>web_search</w:t>
-      </w:r>
-      <w:proofErr w:type="spellEnd"/>
-      <w:r>
-        <w:t> — M6 is better positioned for multi-source weighting + recency checks against IR press releases.</w:t>
-      </w:r>
-    </w:p>
-    <w:p>
-      <w:pPr>
-        <w:numPr>
-          <w:ilvl w:val="0"/>
-          <w:numId w:val="17"/>
-        </w:numPr>
-      </w:pPr>
-      <w:r>
-        <w:rPr>
-          <w:b/>
-          <w:bCs/>
-        </w:rPr>
-        <w:t>No </w:t>
-      </w:r>
-      <w:proofErr w:type="spellStart"/>
-      <w:r>
-        <w:rPr>
-          <w:b/>
-          <w:bCs/>
-        </w:rPr>
-        <w:t>prefunded_warrants_count</w:t>
-      </w:r>
-      <w:proofErr w:type="spellEnd"/>
-      <w:r>
-        <w:rPr>
-          <w:b/>
-          <w:bCs/>
-        </w:rPr>
-        <w:t> / </w:t>
-      </w:r>
-      <w:proofErr w:type="spellStart"/>
-      <w:r>
-        <w:rPr>
-          <w:b/>
-          <w:bCs/>
-        </w:rPr>
-        <w:t>fully_diluted_shares_count</w:t>
-      </w:r>
-      <w:proofErr w:type="spellEnd"/>
-      <w:r>
         <w:rPr>
           <w:b/>
           <w:bCs/>
         </w:rPr>
         <w:t>.</w:t>
-      </w:r>
-      <w:r>
-        <w:t> XBRL has no PFW tag; v1 leaves these NULL. M6 keeps web-searching when its prompt asks.</w:t>
-      </w:r>
-    </w:p>
-    <w:p>
-      <w:pPr>
-        <w:numPr>
-          <w:ilvl w:val="0"/>
-          <w:numId w:val="17"/>
-        </w:numPr>
-      </w:pPr>
-      <w:r>
-        <w:rPr>
-          <w:b/>
-          <w:bCs/>
-        </w:rPr>
-        <w:t>No m6-v4 prompt change this session.</w:t>
-      </w:r>
-      <w:r>
-        <w:t> That requires a paid validation pass (re-running 7 tickers under m6-v4 to confirm the LLM uses the pack-supplied financials). Deferred.</w:t>
-      </w:r>
-    </w:p>
-    <w:p>
-      <w:pPr>
-        <w:rPr>
-          <w:b/>
-          <w:bCs/>
-        </w:rPr>
-      </w:pPr>
-      <w:r>
-        <w:rPr>
-          <w:b/>
-          <w:bCs/>
-        </w:rPr>
-        <w:t>TTL model — why it's per-row, not per-quarter</w:t>
-      </w:r>
-    </w:p>
-    <w:p>
-      <w:r>
-        <w:t xml:space="preserve">Each </w:t>
-      </w:r>
-      <w:proofErr w:type="spellStart"/>
-      <w:r>
-        <w:t>fetch_log</w:t>
-      </w:r>
-      <w:proofErr w:type="spellEnd"/>
-      <w:r>
-        <w:t xml:space="preserve"> row carries (ticker, source, </w:t>
-      </w:r>
-      <w:proofErr w:type="spellStart"/>
-      <w:r>
-        <w:t>last_fetched_at</w:t>
-      </w:r>
-      <w:proofErr w:type="spellEnd"/>
-      <w:r>
-        <w:t xml:space="preserve">, </w:t>
-      </w:r>
-      <w:proofErr w:type="spellStart"/>
-      <w:r>
-        <w:t>last_status</w:t>
-      </w:r>
-      <w:proofErr w:type="spellEnd"/>
-      <w:r>
-        <w:t xml:space="preserve">). On the next run, M4c checks now - </w:t>
-      </w:r>
-      <w:proofErr w:type="spellStart"/>
-      <w:r>
-        <w:t>last_fetched_at</w:t>
-      </w:r>
-      <w:proofErr w:type="spellEnd"/>
-      <w:r>
-        <w:t xml:space="preserve"> &lt; TTL and skips that source for that ticker if fresh. So:</w:t>
-      </w:r>
-    </w:p>
-    <w:p>
-      <w:pPr>
-        <w:numPr>
-          <w:ilvl w:val="0"/>
-          <w:numId w:val="18"/>
-        </w:numPr>
-      </w:pPr>
-      <w:r>
-        <w:t>Re-running tomorrow: zero HTTP calls for any (ticker, source) where </w:t>
-      </w:r>
-      <w:proofErr w:type="spellStart"/>
-      <w:r>
-        <w:t>companyfacts</w:t>
-      </w:r>
-      <w:proofErr w:type="spellEnd"/>
-      <w:r>
-        <w:t> was fetched today.</w:t>
-      </w:r>
-    </w:p>
-    <w:p>
-      <w:pPr>
-        <w:numPr>
-          <w:ilvl w:val="0"/>
-          <w:numId w:val="18"/>
-        </w:numPr>
-      </w:pPr>
-      <w:r>
-        <w:t xml:space="preserve">Re-running in 31 days: </w:t>
-      </w:r>
-      <w:proofErr w:type="spellStart"/>
-      <w:r>
-        <w:t>companyfacts</w:t>
-      </w:r>
-      <w:proofErr w:type="spellEnd"/>
-      <w:r>
-        <w:t xml:space="preserve"> re-fetches (TTL elapsed); submissions+form4+capital_raises also poll for new accession numbers.</w:t>
-      </w:r>
-    </w:p>
-    <w:p>
-      <w:pPr>
-        <w:numPr>
-          <w:ilvl w:val="0"/>
-          <w:numId w:val="18"/>
-        </w:numPr>
-      </w:pPr>
-      <w:r>
-        <w:t>A ticker that failed (e.g. EDGAR 5xx) gets </w:t>
-      </w:r>
-      <w:proofErr w:type="spellStart"/>
-      <w:r>
-        <w:t>last_status</w:t>
-      </w:r>
-      <w:proofErr w:type="spellEnd"/>
-      <w:r>
-        <w:t>='failed' → next run retries it (failure doesn't satisfy TTL).</w:t>
-      </w:r>
-    </w:p>
-    <w:p>
-      <w:r>
-        <w:t>This mirrors the M4a / M2 pattern (</w:t>
-      </w:r>
-      <w:proofErr w:type="spellStart"/>
-      <w:r>
-        <w:t>ticker_snapshot.fetched_at</w:t>
-      </w:r>
-      <w:proofErr w:type="spellEnd"/>
-      <w:r>
-        <w:t xml:space="preserve"> 7d TTL, append-only filings </w:t>
-      </w:r>
-      <w:proofErr w:type="spellStart"/>
-      <w:r>
-        <w:t>dedup</w:t>
-      </w:r>
-      <w:proofErr w:type="spellEnd"/>
-      <w:r>
-        <w:t>), not a "wipe and refresh per quarter" model.</w:t>
-      </w:r>
-    </w:p>
-    <w:p>
-      <w:pPr>
-        <w:rPr>
-          <w:b/>
-          <w:bCs/>
-        </w:rPr>
-      </w:pPr>
-      <w:r>
-        <w:rPr>
-          <w:b/>
-          <w:bCs/>
-        </w:rPr>
-        <w:t>Cost-reduction reality check</w:t>
-      </w:r>
-    </w:p>
-    <w:p>
-      <w:r>
-        <w:t>Originally projected ~3× M6 cost reduction — that assumed the dropped ClinicalTrials.gov scope. With financials-only M4c, the realistic reduction is **</w:t>
-      </w:r>
-      <w:del w:id="0" w:author="Unknown">
-        <w:r>
-          <w:delText>20%** per ticker (</w:delText>
-        </w:r>
-      </w:del>
-      <w:r>
-        <w:t>$0.95 → ~$0.78), full feed ~$93 → ~$76. The big chunk of M6's budget (clinical / catalysts / moat / TAM) stays in M6 by design.</w:t>
-      </w:r>
-    </w:p>
-    <w:p>
-      <w:r>
-        <w:t>Bigger non-monetary wins:</w:t>
-      </w:r>
-    </w:p>
-    <w:p>
-      <w:pPr>
-        <w:numPr>
-          <w:ilvl w:val="0"/>
-          <w:numId w:val="19"/>
-        </w:numPr>
-      </w:pPr>
-      <w:r>
-        <w:rPr>
-          <w:b/>
-          <w:bCs/>
-        </w:rPr>
-        <w:t>Determinism</w:t>
-      </w:r>
-      <w:r>
-        <w:t> — XBRL cash + Form 4 insider rows are pinned to a specific SEC filing; no LLM hallucination drift run-to-run.</w:t>
-      </w:r>
-    </w:p>
-    <w:p>
-      <w:pPr>
-        <w:numPr>
-          <w:ilvl w:val="0"/>
-          <w:numId w:val="19"/>
-        </w:numPr>
-      </w:pPr>
-      <w:r>
-        <w:rPr>
-          <w:b/>
-          <w:bCs/>
-        </w:rPr>
-        <w:t>M6b modifier reliability</w:t>
-      </w:r>
-      <w:r>
-        <w:t> — financing (uses runway), dilution (uses raises), </w:t>
-      </w:r>
-      <w:proofErr w:type="spellStart"/>
-      <w:r>
-        <w:t>cash_floor</w:t>
-      </w:r>
-      <w:proofErr w:type="spellEnd"/>
-      <w:r>
-        <w:t>, </w:t>
-      </w:r>
-      <w:proofErr w:type="spellStart"/>
-      <w:r>
-        <w:t>dilution_overhang</w:t>
-      </w:r>
-      <w:proofErr w:type="spellEnd"/>
-      <w:r>
-        <w:t>, insider all consume more reliable inputs.</w:t>
-      </w:r>
-    </w:p>
-    <w:p>
-      <w:pPr>
-        <w:numPr>
-          <w:ilvl w:val="0"/>
-          <w:numId w:val="19"/>
-        </w:numPr>
-      </w:pPr>
-      <w:r>
-        <w:rPr>
-          <w:b/>
-          <w:bCs/>
-        </w:rPr>
-        <w:lastRenderedPageBreak/>
-        <w:t>Audit trail</w:t>
-      </w:r>
-      <w:r>
-        <w:t> — every capital raise has a </w:t>
-      </w:r>
-      <w:proofErr w:type="spellStart"/>
-      <w:r>
-        <w:t>raw_filing_url</w:t>
-      </w:r>
-      <w:proofErr w:type="spellEnd"/>
-      <w:r>
-        <w:t xml:space="preserve"> even when the parser couldn't extract </w:t>
-      </w:r>
-      <w:proofErr w:type="spellStart"/>
-      <w:r>
-        <w:t>gross_proceeds</w:t>
-      </w:r>
-      <w:proofErr w:type="spellEnd"/>
-      <w:r>
-        <w:t>; you can click through.</w:t>
       </w:r>
     </w:p>
     <w:p/>
@@ -1851,6 +3299,119 @@
     </w:lvl>
   </w:abstractNum>
   <w:abstractNum w:abstractNumId="1" w15:restartNumberingAfterBreak="0">
+    <w:nsid w:val="0996748F"/>
+    <w:multiLevelType w:val="multilevel"/>
+    <w:tmpl w:val="DE2E2184"/>
+    <w:lvl w:ilvl="0">
+      <w:start w:val="1"/>
+      <w:numFmt w:val="decimal"/>
+      <w:lvlText w:val="%1."/>
+      <w:lvlJc w:val="left"/>
+      <w:pPr>
+        <w:tabs>
+          <w:tab w:val="num" w:pos="720"/>
+        </w:tabs>
+        <w:ind w:left="720" w:hanging="360"/>
+      </w:pPr>
+    </w:lvl>
+    <w:lvl w:ilvl="1" w:tentative="1">
+      <w:start w:val="1"/>
+      <w:numFmt w:val="decimal"/>
+      <w:lvlText w:val="%2."/>
+      <w:lvlJc w:val="left"/>
+      <w:pPr>
+        <w:tabs>
+          <w:tab w:val="num" w:pos="1440"/>
+        </w:tabs>
+        <w:ind w:left="1440" w:hanging="360"/>
+      </w:pPr>
+    </w:lvl>
+    <w:lvl w:ilvl="2" w:tentative="1">
+      <w:start w:val="1"/>
+      <w:numFmt w:val="decimal"/>
+      <w:lvlText w:val="%3."/>
+      <w:lvlJc w:val="left"/>
+      <w:pPr>
+        <w:tabs>
+          <w:tab w:val="num" w:pos="2160"/>
+        </w:tabs>
+        <w:ind w:left="2160" w:hanging="360"/>
+      </w:pPr>
+    </w:lvl>
+    <w:lvl w:ilvl="3" w:tentative="1">
+      <w:start w:val="1"/>
+      <w:numFmt w:val="decimal"/>
+      <w:lvlText w:val="%4."/>
+      <w:lvlJc w:val="left"/>
+      <w:pPr>
+        <w:tabs>
+          <w:tab w:val="num" w:pos="2880"/>
+        </w:tabs>
+        <w:ind w:left="2880" w:hanging="360"/>
+      </w:pPr>
+    </w:lvl>
+    <w:lvl w:ilvl="4" w:tentative="1">
+      <w:start w:val="1"/>
+      <w:numFmt w:val="decimal"/>
+      <w:lvlText w:val="%5."/>
+      <w:lvlJc w:val="left"/>
+      <w:pPr>
+        <w:tabs>
+          <w:tab w:val="num" w:pos="3600"/>
+        </w:tabs>
+        <w:ind w:left="3600" w:hanging="360"/>
+      </w:pPr>
+    </w:lvl>
+    <w:lvl w:ilvl="5" w:tentative="1">
+      <w:start w:val="1"/>
+      <w:numFmt w:val="decimal"/>
+      <w:lvlText w:val="%6."/>
+      <w:lvlJc w:val="left"/>
+      <w:pPr>
+        <w:tabs>
+          <w:tab w:val="num" w:pos="4320"/>
+        </w:tabs>
+        <w:ind w:left="4320" w:hanging="360"/>
+      </w:pPr>
+    </w:lvl>
+    <w:lvl w:ilvl="6" w:tentative="1">
+      <w:start w:val="1"/>
+      <w:numFmt w:val="decimal"/>
+      <w:lvlText w:val="%7."/>
+      <w:lvlJc w:val="left"/>
+      <w:pPr>
+        <w:tabs>
+          <w:tab w:val="num" w:pos="5040"/>
+        </w:tabs>
+        <w:ind w:left="5040" w:hanging="360"/>
+      </w:pPr>
+    </w:lvl>
+    <w:lvl w:ilvl="7" w:tentative="1">
+      <w:start w:val="1"/>
+      <w:numFmt w:val="decimal"/>
+      <w:lvlText w:val="%8."/>
+      <w:lvlJc w:val="left"/>
+      <w:pPr>
+        <w:tabs>
+          <w:tab w:val="num" w:pos="5760"/>
+        </w:tabs>
+        <w:ind w:left="5760" w:hanging="360"/>
+      </w:pPr>
+    </w:lvl>
+    <w:lvl w:ilvl="8" w:tentative="1">
+      <w:start w:val="1"/>
+      <w:numFmt w:val="decimal"/>
+      <w:lvlText w:val="%9."/>
+      <w:lvlJc w:val="left"/>
+      <w:pPr>
+        <w:tabs>
+          <w:tab w:val="num" w:pos="6480"/>
+        </w:tabs>
+        <w:ind w:left="6480" w:hanging="360"/>
+      </w:pPr>
+    </w:lvl>
+  </w:abstractNum>
+  <w:abstractNum w:abstractNumId="2" w15:restartNumberingAfterBreak="0">
     <w:nsid w:val="0B492CBB"/>
     <w:multiLevelType w:val="multilevel"/>
     <w:tmpl w:val="5726BC9E"/>
@@ -1963,7 +3524,156 @@
       </w:pPr>
     </w:lvl>
   </w:abstractNum>
-  <w:abstractNum w:abstractNumId="2" w15:restartNumberingAfterBreak="0">
+  <w:abstractNum w:abstractNumId="3" w15:restartNumberingAfterBreak="0">
+    <w:nsid w:val="0DCE5AE7"/>
+    <w:multiLevelType w:val="multilevel"/>
+    <w:tmpl w:val="4E5CA6AC"/>
+    <w:lvl w:ilvl="0">
+      <w:start w:val="1"/>
+      <w:numFmt w:val="bullet"/>
+      <w:lvlText w:val=""/>
+      <w:lvlJc w:val="left"/>
+      <w:pPr>
+        <w:tabs>
+          <w:tab w:val="num" w:pos="720"/>
+        </w:tabs>
+        <w:ind w:left="720" w:hanging="360"/>
+      </w:pPr>
+      <w:rPr>
+        <w:rFonts w:ascii="Symbol" w:hAnsi="Symbol" w:hint="default"/>
+        <w:sz w:val="20"/>
+      </w:rPr>
+    </w:lvl>
+    <w:lvl w:ilvl="1" w:tentative="1">
+      <w:start w:val="1"/>
+      <w:numFmt w:val="bullet"/>
+      <w:lvlText w:val="o"/>
+      <w:lvlJc w:val="left"/>
+      <w:pPr>
+        <w:tabs>
+          <w:tab w:val="num" w:pos="1440"/>
+        </w:tabs>
+        <w:ind w:left="1440" w:hanging="360"/>
+      </w:pPr>
+      <w:rPr>
+        <w:rFonts w:ascii="Courier New" w:hAnsi="Courier New" w:hint="default"/>
+        <w:sz w:val="20"/>
+      </w:rPr>
+    </w:lvl>
+    <w:lvl w:ilvl="2" w:tentative="1">
+      <w:start w:val="1"/>
+      <w:numFmt w:val="bullet"/>
+      <w:lvlText w:val=""/>
+      <w:lvlJc w:val="left"/>
+      <w:pPr>
+        <w:tabs>
+          <w:tab w:val="num" w:pos="2160"/>
+        </w:tabs>
+        <w:ind w:left="2160" w:hanging="360"/>
+      </w:pPr>
+      <w:rPr>
+        <w:rFonts w:ascii="Wingdings" w:hAnsi="Wingdings" w:hint="default"/>
+        <w:sz w:val="20"/>
+      </w:rPr>
+    </w:lvl>
+    <w:lvl w:ilvl="3" w:tentative="1">
+      <w:start w:val="1"/>
+      <w:numFmt w:val="bullet"/>
+      <w:lvlText w:val=""/>
+      <w:lvlJc w:val="left"/>
+      <w:pPr>
+        <w:tabs>
+          <w:tab w:val="num" w:pos="2880"/>
+        </w:tabs>
+        <w:ind w:left="2880" w:hanging="360"/>
+      </w:pPr>
+      <w:rPr>
+        <w:rFonts w:ascii="Wingdings" w:hAnsi="Wingdings" w:hint="default"/>
+        <w:sz w:val="20"/>
+      </w:rPr>
+    </w:lvl>
+    <w:lvl w:ilvl="4" w:tentative="1">
+      <w:start w:val="1"/>
+      <w:numFmt w:val="bullet"/>
+      <w:lvlText w:val=""/>
+      <w:lvlJc w:val="left"/>
+      <w:pPr>
+        <w:tabs>
+          <w:tab w:val="num" w:pos="3600"/>
+        </w:tabs>
+        <w:ind w:left="3600" w:hanging="360"/>
+      </w:pPr>
+      <w:rPr>
+        <w:rFonts w:ascii="Wingdings" w:hAnsi="Wingdings" w:hint="default"/>
+        <w:sz w:val="20"/>
+      </w:rPr>
+    </w:lvl>
+    <w:lvl w:ilvl="5" w:tentative="1">
+      <w:start w:val="1"/>
+      <w:numFmt w:val="bullet"/>
+      <w:lvlText w:val=""/>
+      <w:lvlJc w:val="left"/>
+      <w:pPr>
+        <w:tabs>
+          <w:tab w:val="num" w:pos="4320"/>
+        </w:tabs>
+        <w:ind w:left="4320" w:hanging="360"/>
+      </w:pPr>
+      <w:rPr>
+        <w:rFonts w:ascii="Wingdings" w:hAnsi="Wingdings" w:hint="default"/>
+        <w:sz w:val="20"/>
+      </w:rPr>
+    </w:lvl>
+    <w:lvl w:ilvl="6" w:tentative="1">
+      <w:start w:val="1"/>
+      <w:numFmt w:val="bullet"/>
+      <w:lvlText w:val=""/>
+      <w:lvlJc w:val="left"/>
+      <w:pPr>
+        <w:tabs>
+          <w:tab w:val="num" w:pos="5040"/>
+        </w:tabs>
+        <w:ind w:left="5040" w:hanging="360"/>
+      </w:pPr>
+      <w:rPr>
+        <w:rFonts w:ascii="Wingdings" w:hAnsi="Wingdings" w:hint="default"/>
+        <w:sz w:val="20"/>
+      </w:rPr>
+    </w:lvl>
+    <w:lvl w:ilvl="7" w:tentative="1">
+      <w:start w:val="1"/>
+      <w:numFmt w:val="bullet"/>
+      <w:lvlText w:val=""/>
+      <w:lvlJc w:val="left"/>
+      <w:pPr>
+        <w:tabs>
+          <w:tab w:val="num" w:pos="5760"/>
+        </w:tabs>
+        <w:ind w:left="5760" w:hanging="360"/>
+      </w:pPr>
+      <w:rPr>
+        <w:rFonts w:ascii="Wingdings" w:hAnsi="Wingdings" w:hint="default"/>
+        <w:sz w:val="20"/>
+      </w:rPr>
+    </w:lvl>
+    <w:lvl w:ilvl="8" w:tentative="1">
+      <w:start w:val="1"/>
+      <w:numFmt w:val="bullet"/>
+      <w:lvlText w:val=""/>
+      <w:lvlJc w:val="left"/>
+      <w:pPr>
+        <w:tabs>
+          <w:tab w:val="num" w:pos="6480"/>
+        </w:tabs>
+        <w:ind w:left="6480" w:hanging="360"/>
+      </w:pPr>
+      <w:rPr>
+        <w:rFonts w:ascii="Wingdings" w:hAnsi="Wingdings" w:hint="default"/>
+        <w:sz w:val="20"/>
+      </w:rPr>
+    </w:lvl>
+  </w:abstractNum>
+  <w:abstractNum w:abstractNumId="4" w15:restartNumberingAfterBreak="0">
     <w:nsid w:val="18577917"/>
     <w:multiLevelType w:val="multilevel"/>
     <w:tmpl w:val="7B54B920"/>
@@ -2112,7 +3822,7 @@
       </w:rPr>
     </w:lvl>
   </w:abstractNum>
-  <w:abstractNum w:abstractNumId="3" w15:restartNumberingAfterBreak="0">
+  <w:abstractNum w:abstractNumId="5" w15:restartNumberingAfterBreak="0">
     <w:nsid w:val="1AF56186"/>
     <w:multiLevelType w:val="multilevel"/>
     <w:tmpl w:val="41ACBEC8"/>
@@ -2225,7 +3935,7 @@
       </w:pPr>
     </w:lvl>
   </w:abstractNum>
-  <w:abstractNum w:abstractNumId="4" w15:restartNumberingAfterBreak="0">
+  <w:abstractNum w:abstractNumId="6" w15:restartNumberingAfterBreak="0">
     <w:nsid w:val="2B021B82"/>
     <w:multiLevelType w:val="multilevel"/>
     <w:tmpl w:val="F36E5F90"/>
@@ -2374,7 +4084,7 @@
       </w:rPr>
     </w:lvl>
   </w:abstractNum>
-  <w:abstractNum w:abstractNumId="5" w15:restartNumberingAfterBreak="0">
+  <w:abstractNum w:abstractNumId="7" w15:restartNumberingAfterBreak="0">
     <w:nsid w:val="2BA515AE"/>
     <w:multiLevelType w:val="multilevel"/>
     <w:tmpl w:val="E96A193E"/>
@@ -2487,7 +4197,7 @@
       </w:pPr>
     </w:lvl>
   </w:abstractNum>
-  <w:abstractNum w:abstractNumId="6" w15:restartNumberingAfterBreak="0">
+  <w:abstractNum w:abstractNumId="8" w15:restartNumberingAfterBreak="0">
     <w:nsid w:val="2D6B2CB2"/>
     <w:multiLevelType w:val="multilevel"/>
     <w:tmpl w:val="E2009EF0"/>
@@ -2636,7 +4346,7 @@
       </w:rPr>
     </w:lvl>
   </w:abstractNum>
-  <w:abstractNum w:abstractNumId="7" w15:restartNumberingAfterBreak="0">
+  <w:abstractNum w:abstractNumId="9" w15:restartNumberingAfterBreak="0">
     <w:nsid w:val="30026C07"/>
     <w:multiLevelType w:val="multilevel"/>
     <w:tmpl w:val="16C27788"/>
@@ -2785,7 +4495,7 @@
       </w:rPr>
     </w:lvl>
   </w:abstractNum>
-  <w:abstractNum w:abstractNumId="8" w15:restartNumberingAfterBreak="0">
+  <w:abstractNum w:abstractNumId="10" w15:restartNumberingAfterBreak="0">
     <w:nsid w:val="3E241C4B"/>
     <w:multiLevelType w:val="multilevel"/>
     <w:tmpl w:val="4F445B0E"/>
@@ -2934,7 +4644,156 @@
       </w:rPr>
     </w:lvl>
   </w:abstractNum>
-  <w:abstractNum w:abstractNumId="9" w15:restartNumberingAfterBreak="0">
+  <w:abstractNum w:abstractNumId="11" w15:restartNumberingAfterBreak="0">
+    <w:nsid w:val="41884DFA"/>
+    <w:multiLevelType w:val="multilevel"/>
+    <w:tmpl w:val="540E0932"/>
+    <w:lvl w:ilvl="0">
+      <w:start w:val="1"/>
+      <w:numFmt w:val="bullet"/>
+      <w:lvlText w:val=""/>
+      <w:lvlJc w:val="left"/>
+      <w:pPr>
+        <w:tabs>
+          <w:tab w:val="num" w:pos="720"/>
+        </w:tabs>
+        <w:ind w:left="720" w:hanging="360"/>
+      </w:pPr>
+      <w:rPr>
+        <w:rFonts w:ascii="Symbol" w:hAnsi="Symbol" w:hint="default"/>
+        <w:sz w:val="20"/>
+      </w:rPr>
+    </w:lvl>
+    <w:lvl w:ilvl="1">
+      <w:start w:val="1"/>
+      <w:numFmt w:val="bullet"/>
+      <w:lvlText w:val="o"/>
+      <w:lvlJc w:val="left"/>
+      <w:pPr>
+        <w:tabs>
+          <w:tab w:val="num" w:pos="1440"/>
+        </w:tabs>
+        <w:ind w:left="1440" w:hanging="360"/>
+      </w:pPr>
+      <w:rPr>
+        <w:rFonts w:ascii="Courier New" w:hAnsi="Courier New" w:hint="default"/>
+        <w:sz w:val="20"/>
+      </w:rPr>
+    </w:lvl>
+    <w:lvl w:ilvl="2" w:tentative="1">
+      <w:start w:val="1"/>
+      <w:numFmt w:val="bullet"/>
+      <w:lvlText w:val=""/>
+      <w:lvlJc w:val="left"/>
+      <w:pPr>
+        <w:tabs>
+          <w:tab w:val="num" w:pos="2160"/>
+        </w:tabs>
+        <w:ind w:left="2160" w:hanging="360"/>
+      </w:pPr>
+      <w:rPr>
+        <w:rFonts w:ascii="Wingdings" w:hAnsi="Wingdings" w:hint="default"/>
+        <w:sz w:val="20"/>
+      </w:rPr>
+    </w:lvl>
+    <w:lvl w:ilvl="3" w:tentative="1">
+      <w:start w:val="1"/>
+      <w:numFmt w:val="bullet"/>
+      <w:lvlText w:val=""/>
+      <w:lvlJc w:val="left"/>
+      <w:pPr>
+        <w:tabs>
+          <w:tab w:val="num" w:pos="2880"/>
+        </w:tabs>
+        <w:ind w:left="2880" w:hanging="360"/>
+      </w:pPr>
+      <w:rPr>
+        <w:rFonts w:ascii="Wingdings" w:hAnsi="Wingdings" w:hint="default"/>
+        <w:sz w:val="20"/>
+      </w:rPr>
+    </w:lvl>
+    <w:lvl w:ilvl="4" w:tentative="1">
+      <w:start w:val="1"/>
+      <w:numFmt w:val="bullet"/>
+      <w:lvlText w:val=""/>
+      <w:lvlJc w:val="left"/>
+      <w:pPr>
+        <w:tabs>
+          <w:tab w:val="num" w:pos="3600"/>
+        </w:tabs>
+        <w:ind w:left="3600" w:hanging="360"/>
+      </w:pPr>
+      <w:rPr>
+        <w:rFonts w:ascii="Wingdings" w:hAnsi="Wingdings" w:hint="default"/>
+        <w:sz w:val="20"/>
+      </w:rPr>
+    </w:lvl>
+    <w:lvl w:ilvl="5" w:tentative="1">
+      <w:start w:val="1"/>
+      <w:numFmt w:val="bullet"/>
+      <w:lvlText w:val=""/>
+      <w:lvlJc w:val="left"/>
+      <w:pPr>
+        <w:tabs>
+          <w:tab w:val="num" w:pos="4320"/>
+        </w:tabs>
+        <w:ind w:left="4320" w:hanging="360"/>
+      </w:pPr>
+      <w:rPr>
+        <w:rFonts w:ascii="Wingdings" w:hAnsi="Wingdings" w:hint="default"/>
+        <w:sz w:val="20"/>
+      </w:rPr>
+    </w:lvl>
+    <w:lvl w:ilvl="6" w:tentative="1">
+      <w:start w:val="1"/>
+      <w:numFmt w:val="bullet"/>
+      <w:lvlText w:val=""/>
+      <w:lvlJc w:val="left"/>
+      <w:pPr>
+        <w:tabs>
+          <w:tab w:val="num" w:pos="5040"/>
+        </w:tabs>
+        <w:ind w:left="5040" w:hanging="360"/>
+      </w:pPr>
+      <w:rPr>
+        <w:rFonts w:ascii="Wingdings" w:hAnsi="Wingdings" w:hint="default"/>
+        <w:sz w:val="20"/>
+      </w:rPr>
+    </w:lvl>
+    <w:lvl w:ilvl="7" w:tentative="1">
+      <w:start w:val="1"/>
+      <w:numFmt w:val="bullet"/>
+      <w:lvlText w:val=""/>
+      <w:lvlJc w:val="left"/>
+      <w:pPr>
+        <w:tabs>
+          <w:tab w:val="num" w:pos="5760"/>
+        </w:tabs>
+        <w:ind w:left="5760" w:hanging="360"/>
+      </w:pPr>
+      <w:rPr>
+        <w:rFonts w:ascii="Wingdings" w:hAnsi="Wingdings" w:hint="default"/>
+        <w:sz w:val="20"/>
+      </w:rPr>
+    </w:lvl>
+    <w:lvl w:ilvl="8" w:tentative="1">
+      <w:start w:val="1"/>
+      <w:numFmt w:val="bullet"/>
+      <w:lvlText w:val=""/>
+      <w:lvlJc w:val="left"/>
+      <w:pPr>
+        <w:tabs>
+          <w:tab w:val="num" w:pos="6480"/>
+        </w:tabs>
+        <w:ind w:left="6480" w:hanging="360"/>
+      </w:pPr>
+      <w:rPr>
+        <w:rFonts w:ascii="Wingdings" w:hAnsi="Wingdings" w:hint="default"/>
+        <w:sz w:val="20"/>
+      </w:rPr>
+    </w:lvl>
+  </w:abstractNum>
+  <w:abstractNum w:abstractNumId="12" w15:restartNumberingAfterBreak="0">
     <w:nsid w:val="426E3D8A"/>
     <w:multiLevelType w:val="multilevel"/>
     <w:tmpl w:val="45C4D096"/>
@@ -3047,7 +4906,7 @@
       </w:pPr>
     </w:lvl>
   </w:abstractNum>
-  <w:abstractNum w:abstractNumId="10" w15:restartNumberingAfterBreak="0">
+  <w:abstractNum w:abstractNumId="13" w15:restartNumberingAfterBreak="0">
     <w:nsid w:val="469216FD"/>
     <w:multiLevelType w:val="multilevel"/>
     <w:tmpl w:val="45682742"/>
@@ -3196,7 +5055,7 @@
       </w:rPr>
     </w:lvl>
   </w:abstractNum>
-  <w:abstractNum w:abstractNumId="11" w15:restartNumberingAfterBreak="0">
+  <w:abstractNum w:abstractNumId="14" w15:restartNumberingAfterBreak="0">
     <w:nsid w:val="4EE97587"/>
     <w:multiLevelType w:val="multilevel"/>
     <w:tmpl w:val="0FD0240A"/>
@@ -3345,7 +5204,7 @@
       </w:rPr>
     </w:lvl>
   </w:abstractNum>
-  <w:abstractNum w:abstractNumId="12" w15:restartNumberingAfterBreak="0">
+  <w:abstractNum w:abstractNumId="15" w15:restartNumberingAfterBreak="0">
     <w:nsid w:val="4F971A01"/>
     <w:multiLevelType w:val="multilevel"/>
     <w:tmpl w:val="935499AE"/>
@@ -3494,7 +5353,7 @@
       </w:rPr>
     </w:lvl>
   </w:abstractNum>
-  <w:abstractNum w:abstractNumId="13" w15:restartNumberingAfterBreak="0">
+  <w:abstractNum w:abstractNumId="16" w15:restartNumberingAfterBreak="0">
     <w:nsid w:val="5B9E75C8"/>
     <w:multiLevelType w:val="multilevel"/>
     <w:tmpl w:val="AD121200"/>
@@ -3643,7 +5502,7 @@
       </w:rPr>
     </w:lvl>
   </w:abstractNum>
-  <w:abstractNum w:abstractNumId="14" w15:restartNumberingAfterBreak="0">
+  <w:abstractNum w:abstractNumId="17" w15:restartNumberingAfterBreak="0">
     <w:nsid w:val="6019791F"/>
     <w:multiLevelType w:val="multilevel"/>
     <w:tmpl w:val="BCACC2C2"/>
@@ -3760,7 +5619,7 @@
       </w:pPr>
     </w:lvl>
   </w:abstractNum>
-  <w:abstractNum w:abstractNumId="15" w15:restartNumberingAfterBreak="0">
+  <w:abstractNum w:abstractNumId="18" w15:restartNumberingAfterBreak="0">
     <w:nsid w:val="6AB90834"/>
     <w:multiLevelType w:val="multilevel"/>
     <w:tmpl w:val="D932E20E"/>
@@ -3909,7 +5768,7 @@
       </w:rPr>
     </w:lvl>
   </w:abstractNum>
-  <w:abstractNum w:abstractNumId="16" w15:restartNumberingAfterBreak="0">
+  <w:abstractNum w:abstractNumId="19" w15:restartNumberingAfterBreak="0">
     <w:nsid w:val="6D941EE3"/>
     <w:multiLevelType w:val="multilevel"/>
     <w:tmpl w:val="642C83A6"/>
@@ -4026,7 +5885,7 @@
       </w:pPr>
     </w:lvl>
   </w:abstractNum>
-  <w:abstractNum w:abstractNumId="17" w15:restartNumberingAfterBreak="0">
+  <w:abstractNum w:abstractNumId="20" w15:restartNumberingAfterBreak="0">
     <w:nsid w:val="6DF36162"/>
     <w:multiLevelType w:val="multilevel"/>
     <w:tmpl w:val="75AE2094"/>
@@ -4175,7 +6034,7 @@
       </w:rPr>
     </w:lvl>
   </w:abstractNum>
-  <w:abstractNum w:abstractNumId="18" w15:restartNumberingAfterBreak="0">
+  <w:abstractNum w:abstractNumId="21" w15:restartNumberingAfterBreak="0">
     <w:nsid w:val="771D5381"/>
     <w:multiLevelType w:val="multilevel"/>
     <w:tmpl w:val="8834C4EA"/>
@@ -4325,61 +6184,70 @@
     </w:lvl>
   </w:abstractNum>
   <w:num w:numId="1" w16cid:durableId="506213925">
-    <w:abstractNumId w:val="14"/>
+    <w:abstractNumId w:val="17"/>
   </w:num>
   <w:num w:numId="2" w16cid:durableId="662856230">
-    <w:abstractNumId w:val="17"/>
+    <w:abstractNumId w:val="20"/>
   </w:num>
   <w:num w:numId="3" w16cid:durableId="1799061463">
-    <w:abstractNumId w:val="6"/>
+    <w:abstractNumId w:val="8"/>
   </w:num>
   <w:num w:numId="4" w16cid:durableId="230695373">
-    <w:abstractNumId w:val="12"/>
+    <w:abstractNumId w:val="15"/>
   </w:num>
   <w:num w:numId="5" w16cid:durableId="1976835774">
-    <w:abstractNumId w:val="16"/>
+    <w:abstractNumId w:val="19"/>
   </w:num>
   <w:num w:numId="6" w16cid:durableId="1069696004">
-    <w:abstractNumId w:val="3"/>
+    <w:abstractNumId w:val="5"/>
   </w:num>
   <w:num w:numId="7" w16cid:durableId="1347444858">
-    <w:abstractNumId w:val="2"/>
+    <w:abstractNumId w:val="4"/>
   </w:num>
   <w:num w:numId="8" w16cid:durableId="2012639250">
     <w:abstractNumId w:val="0"/>
   </w:num>
   <w:num w:numId="9" w16cid:durableId="1308704556">
-    <w:abstractNumId w:val="4"/>
+    <w:abstractNumId w:val="6"/>
   </w:num>
   <w:num w:numId="10" w16cid:durableId="2066443705">
+    <w:abstractNumId w:val="16"/>
+  </w:num>
+  <w:num w:numId="11" w16cid:durableId="1921407015">
+    <w:abstractNumId w:val="7"/>
+  </w:num>
+  <w:num w:numId="12" w16cid:durableId="1345748217">
+    <w:abstractNumId w:val="2"/>
+  </w:num>
+  <w:num w:numId="13" w16cid:durableId="1219514716">
+    <w:abstractNumId w:val="12"/>
+  </w:num>
+  <w:num w:numId="14" w16cid:durableId="100802226">
+    <w:abstractNumId w:val="9"/>
+  </w:num>
+  <w:num w:numId="15" w16cid:durableId="1609041877">
+    <w:abstractNumId w:val="18"/>
+  </w:num>
+  <w:num w:numId="16" w16cid:durableId="2146701184">
+    <w:abstractNumId w:val="21"/>
+  </w:num>
+  <w:num w:numId="17" w16cid:durableId="2039743379">
+    <w:abstractNumId w:val="14"/>
+  </w:num>
+  <w:num w:numId="18" w16cid:durableId="1460223104">
+    <w:abstractNumId w:val="10"/>
+  </w:num>
+  <w:num w:numId="19" w16cid:durableId="1224104767">
     <w:abstractNumId w:val="13"/>
   </w:num>
-  <w:num w:numId="11" w16cid:durableId="1921407015">
-    <w:abstractNumId w:val="5"/>
+  <w:num w:numId="20" w16cid:durableId="576936133">
+    <w:abstractNumId w:val="11"/>
   </w:num>
-  <w:num w:numId="12" w16cid:durableId="1345748217">
+  <w:num w:numId="21" w16cid:durableId="407535259">
     <w:abstractNumId w:val="1"/>
   </w:num>
-  <w:num w:numId="13" w16cid:durableId="1219514716">
-    <w:abstractNumId w:val="9"/>
-  </w:num>
-  <w:num w:numId="14" w16cid:durableId="100802226">
-    <w:abstractNumId w:val="7"/>
-  </w:num>
-  <w:num w:numId="15" w16cid:durableId="1609041877">
-    <w:abstractNumId w:val="15"/>
-  </w:num>
-  <w:num w:numId="16" w16cid:durableId="2146701184">
-    <w:abstractNumId w:val="18"/>
-  </w:num>
-  <w:num w:numId="17" w16cid:durableId="2039743379">
-    <w:abstractNumId w:val="11"/>
-  </w:num>
-  <w:num w:numId="18" w16cid:durableId="1460223104">
-    <w:abstractNumId w:val="8"/>
-  </w:num>
-  <w:num w:numId="19" w16cid:durableId="1224104767">
-    <w:abstractNumId w:val="10"/>
+  <w:num w:numId="22" w16cid:durableId="1378965225">
+    <w:abstractNumId w:val="3"/>
   </w:num>
 </w:numbering>
 </file>

</xml_diff>